<commit_message>
sql 12 13 14
</commit_message>
<xml_diff>
--- a/Практика/УП0.3/SQL/отчет 11.docx
+++ b/Практика/УП0.3/SQL/отчет 11.docx
@@ -1,6 +1,6 @@
 
 <file path=word/document.xml><?xml version="1.0" encoding="utf-8"?>
-<w:document xmlns:wpc="http://schemas.microsoft.com/office/word/2010/wordprocessingCanvas" xmlns:mc="http://schemas.openxmlformats.org/markup-compatibility/2006" xmlns:o="urn:schemas-microsoft-com:office:office" xmlns:r="http://schemas.openxmlformats.org/officeDocument/2006/relationships" xmlns:m="http://schemas.openxmlformats.org/officeDocument/2006/math" xmlns:v="urn:schemas-microsoft-com:vml" xmlns:wp14="http://schemas.microsoft.com/office/word/2010/wordprocessingDrawing" xmlns:wp="http://schemas.openxmlformats.org/drawingml/2006/wordprocessingDrawing" xmlns:w10="urn:schemas-microsoft-com:office:word" xmlns:w="http://schemas.openxmlformats.org/wordprocessingml/2006/main" xmlns:w14="http://schemas.microsoft.com/office/word/2010/wordml" xmlns:wpg="http://schemas.microsoft.com/office/word/2010/wordprocessingGroup" xmlns:wpi="http://schemas.microsoft.com/office/word/2010/wordprocessingInk" xmlns:wne="http://schemas.microsoft.com/office/word/2006/wordml" xmlns:wps="http://schemas.microsoft.com/office/word/2010/wordprocessingShape" mc:Ignorable="w14 wp14">
+<w:document xmlns:ve="http://schemas.openxmlformats.org/markup-compatibility/2006" xmlns:o="urn:schemas-microsoft-com:office:office" xmlns:r="http://schemas.openxmlformats.org/officeDocument/2006/relationships" xmlns:m="http://schemas.openxmlformats.org/officeDocument/2006/math" xmlns:v="urn:schemas-microsoft-com:vml" xmlns:wp="http://schemas.openxmlformats.org/drawingml/2006/wordprocessingDrawing" xmlns:w10="urn:schemas-microsoft-com:office:word" xmlns:w="http://schemas.openxmlformats.org/wordprocessingml/2006/main" xmlns:wne="http://schemas.microsoft.com/office/word/2006/wordml">
   <w:body>
     <w:p/>
     <w:p>
@@ -18,7 +18,7 @@
           <w:lang w:val="ru-RU" w:eastAsia="ru-RU"/>
         </w:rPr>
         <w:drawing>
-          <wp:anchor distT="0" distB="0" distL="114300" distR="114300" simplePos="0" relativeHeight="251659264" behindDoc="0" locked="0" layoutInCell="1" allowOverlap="1" wp14:anchorId="547172F8" wp14:editId="1F547248">
+          <wp:anchor distT="0" distB="0" distL="114300" distR="114300" simplePos="0" relativeHeight="251659264" behindDoc="0" locked="0" layoutInCell="1" allowOverlap="1">
             <wp:simplePos x="0" y="0"/>
             <wp:positionH relativeFrom="margin">
               <wp:align>left</wp:align>
@@ -43,10 +43,10 @@
                     </pic:cNvPicPr>
                   </pic:nvPicPr>
                   <pic:blipFill>
-                    <a:blip r:embed="rId6" cstate="print">
+                    <a:blip r:embed="rId5" cstate="print">
                       <a:extLst>
                         <a:ext uri="{28A0092B-C50C-407E-A947-70E740481C1C}">
-                          <a14:useLocalDpi xmlns:a14="http://schemas.microsoft.com/office/drawing/2010/main" val="0"/>
+                          <a14:useLocalDpi xmlns:a14="http://schemas.microsoft.com/office/drawing/2010/main" xmlns:wps="http://schemas.microsoft.com/office/word/2010/wordprocessingShape" xmlns:wpi="http://schemas.microsoft.com/office/word/2010/wordprocessingInk" xmlns:wpg="http://schemas.microsoft.com/office/word/2010/wordprocessingGroup" xmlns:w14="http://schemas.microsoft.com/office/word/2010/wordml" xmlns:w="http://schemas.openxmlformats.org/wordprocessingml/2006/main" xmlns:w10="urn:schemas-microsoft-com:office:word" xmlns:wp14="http://schemas.microsoft.com/office/word/2010/wordprocessingDrawing" xmlns:v="urn:schemas-microsoft-com:vml" xmlns:o="urn:schemas-microsoft-com:office:office" xmlns:mc="http://schemas.openxmlformats.org/markup-compatibility/2006" xmlns:wpc="http://schemas.microsoft.com/office/word/2010/wordprocessingCanvas" xmlns="" val="0"/>
                         </a:ext>
                       </a:extLst>
                     </a:blip>
@@ -696,20 +696,20 @@
     </w:p>
     <w:sdt>
       <w:sdtPr>
+        <w:rPr>
+          <w:rFonts w:ascii="Times New Roman" w:eastAsiaTheme="minorEastAsia" w:hAnsi="Times New Roman" w:cstheme="minorBidi"/>
+          <w:b w:val="0"/>
+          <w:bCs w:val="0"/>
+          <w:color w:val="auto"/>
+          <w:szCs w:val="22"/>
+          <w:lang w:val="en-US" w:eastAsia="en-US"/>
+        </w:rPr>
         <w:id w:val="136232828"/>
         <w:docPartObj>
           <w:docPartGallery w:val="Table of Contents"/>
           <w:docPartUnique/>
         </w:docPartObj>
       </w:sdtPr>
-      <w:sdtEndPr>
-        <w:rPr>
-          <w:rFonts w:ascii="Times New Roman" w:eastAsiaTheme="minorEastAsia" w:hAnsi="Times New Roman" w:cstheme="minorBidi"/>
-          <w:color w:val="auto"/>
-          <w:szCs w:val="22"/>
-          <w:lang w:val="en-US" w:eastAsia="en-US"/>
-        </w:rPr>
-      </w:sdtEndPr>
       <w:sdtContent>
         <w:p>
           <w:pPr>
@@ -726,7 +726,10 @@
               <w:tab w:val="right" w:leader="dot" w:pos="9345"/>
             </w:tabs>
             <w:rPr>
+              <w:rFonts w:asciiTheme="minorHAnsi" w:hAnsiTheme="minorHAnsi"/>
               <w:noProof/>
+              <w:sz w:val="22"/>
+              <w:lang w:val="ru-RU" w:eastAsia="ru-RU"/>
             </w:rPr>
           </w:pPr>
           <w:r>
@@ -786,7 +789,7 @@
           <w:r>
             <w:fldChar w:fldCharType="separate"/>
           </w:r>
-          <w:hyperlink w:anchor="_Toc222822586" w:history="1">
+          <w:hyperlink w:anchor="_Toc222945232" w:history="1">
             <w:r>
               <w:rPr>
                 <w:rStyle w:val="a6"/>
@@ -815,7 +818,7 @@
                 <w:noProof/>
                 <w:webHidden/>
               </w:rPr>
-              <w:instrText xml:space="preserve"> PAGEREF _Toc222822586 \h </w:instrText>
+              <w:instrText xml:space="preserve"> PAGEREF _Toc222945232 \h </w:instrText>
             </w:r>
             <w:r>
               <w:rPr>
@@ -835,7 +838,7 @@
                 <w:noProof/>
                 <w:webHidden/>
               </w:rPr>
-              <w:t>3</w:t>
+              <w:t>4</w:t>
             </w:r>
             <w:r>
               <w:rPr>
@@ -853,10 +856,13 @@
               <w:tab w:val="right" w:leader="dot" w:pos="9345"/>
             </w:tabs>
             <w:rPr>
+              <w:rFonts w:asciiTheme="minorHAnsi" w:hAnsiTheme="minorHAnsi"/>
               <w:noProof/>
+              <w:sz w:val="22"/>
+              <w:lang w:val="ru-RU" w:eastAsia="ru-RU"/>
             </w:rPr>
           </w:pPr>
-          <w:hyperlink w:anchor="_Toc222822587" w:history="1">
+          <w:hyperlink w:anchor="_Toc222945233" w:history="1">
             <w:r>
               <w:rPr>
                 <w:rStyle w:val="a6"/>
@@ -885,7 +891,7 @@
                 <w:noProof/>
                 <w:webHidden/>
               </w:rPr>
-              <w:instrText xml:space="preserve"> PAGEREF _Toc222822587 \h </w:instrText>
+              <w:instrText xml:space="preserve"> PAGEREF _Toc222945233 \h </w:instrText>
             </w:r>
             <w:r>
               <w:rPr>
@@ -905,7 +911,7 @@
                 <w:noProof/>
                 <w:webHidden/>
               </w:rPr>
-              <w:t>3</w:t>
+              <w:t>4</w:t>
             </w:r>
             <w:r>
               <w:rPr>
@@ -923,10 +929,13 @@
               <w:tab w:val="right" w:leader="dot" w:pos="9345"/>
             </w:tabs>
             <w:rPr>
+              <w:rFonts w:asciiTheme="minorHAnsi" w:hAnsiTheme="minorHAnsi"/>
               <w:noProof/>
+              <w:sz w:val="22"/>
+              <w:lang w:val="ru-RU" w:eastAsia="ru-RU"/>
             </w:rPr>
           </w:pPr>
-          <w:hyperlink w:anchor="_Toc222822588" w:history="1">
+          <w:hyperlink w:anchor="_Toc222945234" w:history="1">
             <w:r>
               <w:rPr>
                 <w:rStyle w:val="a6"/>
@@ -954,7 +963,7 @@
                 <w:noProof/>
                 <w:webHidden/>
               </w:rPr>
-              <w:instrText xml:space="preserve"> PAGEREF _Toc222822588 \h </w:instrText>
+              <w:instrText xml:space="preserve"> PAGEREF _Toc222945234 \h </w:instrText>
             </w:r>
             <w:r>
               <w:rPr>
@@ -974,7 +983,7 @@
                 <w:noProof/>
                 <w:webHidden/>
               </w:rPr>
-              <w:t>3</w:t>
+              <w:t>4</w:t>
             </w:r>
             <w:r>
               <w:rPr>
@@ -992,10 +1001,13 @@
               <w:tab w:val="right" w:leader="dot" w:pos="9345"/>
             </w:tabs>
             <w:rPr>
+              <w:rFonts w:asciiTheme="minorHAnsi" w:hAnsiTheme="minorHAnsi"/>
               <w:noProof/>
+              <w:sz w:val="22"/>
+              <w:lang w:val="ru-RU" w:eastAsia="ru-RU"/>
             </w:rPr>
           </w:pPr>
-          <w:hyperlink w:anchor="_Toc222822589" w:history="1">
+          <w:hyperlink w:anchor="_Toc222945235" w:history="1">
             <w:r>
               <w:rPr>
                 <w:rStyle w:val="a6"/>
@@ -1023,7 +1035,7 @@
                 <w:noProof/>
                 <w:webHidden/>
               </w:rPr>
-              <w:instrText xml:space="preserve"> PAGEREF _Toc222822589 \h </w:instrText>
+              <w:instrText xml:space="preserve"> PAGEREF _Toc222945235 \h </w:instrText>
             </w:r>
             <w:r>
               <w:rPr>
@@ -1043,7 +1055,7 @@
                 <w:noProof/>
                 <w:webHidden/>
               </w:rPr>
-              <w:t>4</w:t>
+              <w:t>5</w:t>
             </w:r>
             <w:r>
               <w:rPr>
@@ -1061,10 +1073,13 @@
               <w:tab w:val="right" w:leader="dot" w:pos="9345"/>
             </w:tabs>
             <w:rPr>
+              <w:rFonts w:asciiTheme="minorHAnsi" w:hAnsiTheme="minorHAnsi"/>
               <w:noProof/>
+              <w:sz w:val="22"/>
+              <w:lang w:val="ru-RU" w:eastAsia="ru-RU"/>
             </w:rPr>
           </w:pPr>
-          <w:hyperlink w:anchor="_Toc222822590" w:history="1">
+          <w:hyperlink w:anchor="_Toc222945236" w:history="1">
             <w:r>
               <w:rPr>
                 <w:rStyle w:val="a6"/>
@@ -1092,7 +1107,7 @@
                 <w:noProof/>
                 <w:webHidden/>
               </w:rPr>
-              <w:instrText xml:space="preserve"> PAGEREF _Toc222822590 \h </w:instrText>
+              <w:instrText xml:space="preserve"> PAGEREF _Toc222945236 \h </w:instrText>
             </w:r>
             <w:r>
               <w:rPr>
@@ -1112,7 +1127,7 @@
                 <w:noProof/>
                 <w:webHidden/>
               </w:rPr>
-              <w:t>4</w:t>
+              <w:t>5</w:t>
             </w:r>
             <w:r>
               <w:rPr>
@@ -1130,10 +1145,13 @@
               <w:tab w:val="right" w:leader="dot" w:pos="9345"/>
             </w:tabs>
             <w:rPr>
+              <w:rFonts w:asciiTheme="minorHAnsi" w:hAnsiTheme="minorHAnsi"/>
               <w:noProof/>
+              <w:sz w:val="22"/>
+              <w:lang w:val="ru-RU" w:eastAsia="ru-RU"/>
             </w:rPr>
           </w:pPr>
-          <w:hyperlink w:anchor="_Toc222822591" w:history="1">
+          <w:hyperlink w:anchor="_Toc222945237" w:history="1">
             <w:r>
               <w:rPr>
                 <w:rStyle w:val="a6"/>
@@ -1161,7 +1179,7 @@
                 <w:noProof/>
                 <w:webHidden/>
               </w:rPr>
-              <w:instrText xml:space="preserve"> PAGEREF _Toc222822591 \h </w:instrText>
+              <w:instrText xml:space="preserve"> PAGEREF _Toc222945237 \h </w:instrText>
             </w:r>
             <w:r>
               <w:rPr>
@@ -1181,7 +1199,7 @@
                 <w:noProof/>
                 <w:webHidden/>
               </w:rPr>
-              <w:t>4</w:t>
+              <w:t>5</w:t>
             </w:r>
             <w:r>
               <w:rPr>
@@ -1199,10 +1217,13 @@
               <w:tab w:val="right" w:leader="dot" w:pos="9345"/>
             </w:tabs>
             <w:rPr>
+              <w:rFonts w:asciiTheme="minorHAnsi" w:hAnsiTheme="minorHAnsi"/>
               <w:noProof/>
+              <w:sz w:val="22"/>
+              <w:lang w:val="ru-RU" w:eastAsia="ru-RU"/>
             </w:rPr>
           </w:pPr>
-          <w:hyperlink w:anchor="_Toc222822592" w:history="1">
+          <w:hyperlink w:anchor="_Toc222945238" w:history="1">
             <w:r>
               <w:rPr>
                 <w:rStyle w:val="a6"/>
@@ -1230,7 +1251,7 @@
                 <w:noProof/>
                 <w:webHidden/>
               </w:rPr>
-              <w:instrText xml:space="preserve"> PAGEREF _Toc222822592 \h </w:instrText>
+              <w:instrText xml:space="preserve"> PAGEREF _Toc222945238 \h </w:instrText>
             </w:r>
             <w:r>
               <w:rPr>
@@ -1250,7 +1271,7 @@
                 <w:noProof/>
                 <w:webHidden/>
               </w:rPr>
-              <w:t>5</w:t>
+              <w:t>6</w:t>
             </w:r>
             <w:r>
               <w:rPr>
@@ -1268,10 +1289,13 @@
               <w:tab w:val="right" w:leader="dot" w:pos="9345"/>
             </w:tabs>
             <w:rPr>
+              <w:rFonts w:asciiTheme="minorHAnsi" w:hAnsiTheme="minorHAnsi"/>
               <w:noProof/>
+              <w:sz w:val="22"/>
+              <w:lang w:val="ru-RU" w:eastAsia="ru-RU"/>
             </w:rPr>
           </w:pPr>
-          <w:hyperlink w:anchor="_Toc222822593" w:history="1">
+          <w:hyperlink w:anchor="_Toc222945239" w:history="1">
             <w:r>
               <w:rPr>
                 <w:rStyle w:val="a6"/>
@@ -1299,7 +1323,7 @@
                 <w:noProof/>
                 <w:webHidden/>
               </w:rPr>
-              <w:instrText xml:space="preserve"> PAGEREF _Toc222822593 \h </w:instrText>
+              <w:instrText xml:space="preserve"> PAGEREF _Toc222945239 \h </w:instrText>
             </w:r>
             <w:r>
               <w:rPr>
@@ -1319,7 +1343,7 @@
                 <w:noProof/>
                 <w:webHidden/>
               </w:rPr>
-              <w:t>5</w:t>
+              <w:t>6</w:t>
             </w:r>
             <w:r>
               <w:rPr>
@@ -1337,10 +1361,13 @@
               <w:tab w:val="right" w:leader="dot" w:pos="9345"/>
             </w:tabs>
             <w:rPr>
+              <w:rFonts w:asciiTheme="minorHAnsi" w:hAnsiTheme="minorHAnsi"/>
               <w:noProof/>
+              <w:sz w:val="22"/>
+              <w:lang w:val="ru-RU" w:eastAsia="ru-RU"/>
             </w:rPr>
           </w:pPr>
-          <w:hyperlink w:anchor="_Toc222822594" w:history="1">
+          <w:hyperlink w:anchor="_Toc222945240" w:history="1">
             <w:r>
               <w:rPr>
                 <w:rStyle w:val="a6"/>
@@ -1368,7 +1395,7 @@
                 <w:noProof/>
                 <w:webHidden/>
               </w:rPr>
-              <w:instrText xml:space="preserve"> PAGEREF _Toc222822594 \h </w:instrText>
+              <w:instrText xml:space="preserve"> PAGEREF _Toc222945240 \h </w:instrText>
             </w:r>
             <w:r>
               <w:rPr>
@@ -1388,7 +1415,7 @@
                 <w:noProof/>
                 <w:webHidden/>
               </w:rPr>
-              <w:t>5</w:t>
+              <w:t>6</w:t>
             </w:r>
             <w:r>
               <w:rPr>
@@ -1406,10 +1433,13 @@
               <w:tab w:val="right" w:leader="dot" w:pos="9345"/>
             </w:tabs>
             <w:rPr>
+              <w:rFonts w:asciiTheme="minorHAnsi" w:hAnsiTheme="minorHAnsi"/>
               <w:noProof/>
+              <w:sz w:val="22"/>
+              <w:lang w:val="ru-RU" w:eastAsia="ru-RU"/>
             </w:rPr>
           </w:pPr>
-          <w:hyperlink w:anchor="_Toc222822595" w:history="1">
+          <w:hyperlink w:anchor="_Toc222945241" w:history="1">
             <w:r>
               <w:rPr>
                 <w:rStyle w:val="a6"/>
@@ -1437,7 +1467,7 @@
                 <w:noProof/>
                 <w:webHidden/>
               </w:rPr>
-              <w:instrText xml:space="preserve"> PAGEREF _Toc222822595 \h </w:instrText>
+              <w:instrText xml:space="preserve"> PAGEREF _Toc222945241 \h </w:instrText>
             </w:r>
             <w:r>
               <w:rPr>
@@ -1457,7 +1487,7 @@
                 <w:noProof/>
                 <w:webHidden/>
               </w:rPr>
-              <w:t>6</w:t>
+              <w:t>7</w:t>
             </w:r>
             <w:r>
               <w:rPr>
@@ -1475,10 +1505,13 @@
               <w:tab w:val="right" w:leader="dot" w:pos="9345"/>
             </w:tabs>
             <w:rPr>
+              <w:rFonts w:asciiTheme="minorHAnsi" w:hAnsiTheme="minorHAnsi"/>
               <w:noProof/>
+              <w:sz w:val="22"/>
+              <w:lang w:val="ru-RU" w:eastAsia="ru-RU"/>
             </w:rPr>
           </w:pPr>
-          <w:hyperlink w:anchor="_Toc222822596" w:history="1">
+          <w:hyperlink w:anchor="_Toc222945242" w:history="1">
             <w:r>
               <w:rPr>
                 <w:rStyle w:val="a6"/>
@@ -1506,7 +1539,7 @@
                 <w:noProof/>
                 <w:webHidden/>
               </w:rPr>
-              <w:instrText xml:space="preserve"> PAGEREF _Toc222822596 \h </w:instrText>
+              <w:instrText xml:space="preserve"> PAGEREF _Toc222945242 \h </w:instrText>
             </w:r>
             <w:r>
               <w:rPr>
@@ -1526,7 +1559,7 @@
                 <w:noProof/>
                 <w:webHidden/>
               </w:rPr>
-              <w:t>6</w:t>
+              <w:t>7</w:t>
             </w:r>
             <w:r>
               <w:rPr>
@@ -1544,10 +1577,13 @@
               <w:tab w:val="right" w:leader="dot" w:pos="9345"/>
             </w:tabs>
             <w:rPr>
+              <w:rFonts w:asciiTheme="minorHAnsi" w:hAnsiTheme="minorHAnsi"/>
               <w:noProof/>
+              <w:sz w:val="22"/>
+              <w:lang w:val="ru-RU" w:eastAsia="ru-RU"/>
             </w:rPr>
           </w:pPr>
-          <w:hyperlink w:anchor="_Toc222822597" w:history="1">
+          <w:hyperlink w:anchor="_Toc222945243" w:history="1">
             <w:r>
               <w:rPr>
                 <w:rStyle w:val="a6"/>
@@ -1575,7 +1611,7 @@
                 <w:noProof/>
                 <w:webHidden/>
               </w:rPr>
-              <w:instrText xml:space="preserve"> PAGEREF _Toc222822597 \h </w:instrText>
+              <w:instrText xml:space="preserve"> PAGEREF _Toc222945243 \h </w:instrText>
             </w:r>
             <w:r>
               <w:rPr>
@@ -1595,7 +1631,7 @@
                 <w:noProof/>
                 <w:webHidden/>
               </w:rPr>
-              <w:t>7</w:t>
+              <w:t>8</w:t>
             </w:r>
             <w:r>
               <w:rPr>
@@ -1613,10 +1649,13 @@
               <w:tab w:val="right" w:leader="dot" w:pos="9345"/>
             </w:tabs>
             <w:rPr>
+              <w:rFonts w:asciiTheme="minorHAnsi" w:hAnsiTheme="minorHAnsi"/>
               <w:noProof/>
+              <w:sz w:val="22"/>
+              <w:lang w:val="ru-RU" w:eastAsia="ru-RU"/>
             </w:rPr>
           </w:pPr>
-          <w:hyperlink w:anchor="_Toc222822598" w:history="1">
+          <w:hyperlink w:anchor="_Toc222945244" w:history="1">
             <w:r>
               <w:rPr>
                 <w:rStyle w:val="a6"/>
@@ -1644,7 +1683,7 @@
                 <w:noProof/>
                 <w:webHidden/>
               </w:rPr>
-              <w:instrText xml:space="preserve"> PAGEREF _Toc222822598 \h </w:instrText>
+              <w:instrText xml:space="preserve"> PAGEREF _Toc222945244 \h </w:instrText>
             </w:r>
             <w:r>
               <w:rPr>
@@ -1682,10 +1721,13 @@
               <w:tab w:val="right" w:leader="dot" w:pos="9345"/>
             </w:tabs>
             <w:rPr>
+              <w:rFonts w:asciiTheme="minorHAnsi" w:hAnsiTheme="minorHAnsi"/>
               <w:noProof/>
+              <w:sz w:val="22"/>
+              <w:lang w:val="ru-RU" w:eastAsia="ru-RU"/>
             </w:rPr>
           </w:pPr>
-          <w:hyperlink w:anchor="_Toc222822599" w:history="1">
+          <w:hyperlink w:anchor="_Toc222945245" w:history="1">
             <w:r>
               <w:rPr>
                 <w:rStyle w:val="a6"/>
@@ -1713,7 +1755,7 @@
                 <w:noProof/>
                 <w:webHidden/>
               </w:rPr>
-              <w:instrText xml:space="preserve"> PAGEREF _Toc222822599 \h </w:instrText>
+              <w:instrText xml:space="preserve"> PAGEREF _Toc222945245 \h </w:instrText>
             </w:r>
             <w:r>
               <w:rPr>
@@ -1751,10 +1793,13 @@
               <w:tab w:val="right" w:leader="dot" w:pos="9345"/>
             </w:tabs>
             <w:rPr>
+              <w:rFonts w:asciiTheme="minorHAnsi" w:hAnsiTheme="minorHAnsi"/>
               <w:noProof/>
+              <w:sz w:val="22"/>
+              <w:lang w:val="ru-RU" w:eastAsia="ru-RU"/>
             </w:rPr>
           </w:pPr>
-          <w:hyperlink w:anchor="_Toc222822600" w:history="1">
+          <w:hyperlink w:anchor="_Toc222945246" w:history="1">
             <w:r>
               <w:rPr>
                 <w:rStyle w:val="a6"/>
@@ -1782,7 +1827,7 @@
                 <w:noProof/>
                 <w:webHidden/>
               </w:rPr>
-              <w:instrText xml:space="preserve"> PAGEREF _Toc222822600 \h </w:instrText>
+              <w:instrText xml:space="preserve"> PAGEREF _Toc222945246 \h </w:instrText>
             </w:r>
             <w:r>
               <w:rPr>
@@ -1802,7 +1847,7 @@
                 <w:noProof/>
                 <w:webHidden/>
               </w:rPr>
-              <w:t>10</w:t>
+              <w:t>9</w:t>
             </w:r>
             <w:r>
               <w:rPr>
@@ -1820,10 +1865,13 @@
               <w:tab w:val="right" w:leader="dot" w:pos="9345"/>
             </w:tabs>
             <w:rPr>
+              <w:rFonts w:asciiTheme="minorHAnsi" w:hAnsiTheme="minorHAnsi"/>
               <w:noProof/>
+              <w:sz w:val="22"/>
+              <w:lang w:val="ru-RU" w:eastAsia="ru-RU"/>
             </w:rPr>
           </w:pPr>
-          <w:hyperlink w:anchor="_Toc222822601" w:history="1">
+          <w:hyperlink w:anchor="_Toc222945247" w:history="1">
             <w:r>
               <w:rPr>
                 <w:rStyle w:val="a6"/>
@@ -1851,7 +1899,7 @@
                 <w:noProof/>
                 <w:webHidden/>
               </w:rPr>
-              <w:instrText xml:space="preserve"> PAGEREF _Toc222822601 \h </w:instrText>
+              <w:instrText xml:space="preserve"> PAGEREF _Toc222945247 \h </w:instrText>
             </w:r>
             <w:r>
               <w:rPr>
@@ -1871,7 +1919,943 @@
                 <w:noProof/>
                 <w:webHidden/>
               </w:rPr>
+              <w:t>10</w:t>
+            </w:r>
+            <w:r>
+              <w:rPr>
+                <w:noProof/>
+                <w:webHidden/>
+              </w:rPr>
+              <w:fldChar w:fldCharType="end"/>
+            </w:r>
+          </w:hyperlink>
+        </w:p>
+        <w:p>
+          <w:pPr>
+            <w:pStyle w:val="11"/>
+            <w:tabs>
+              <w:tab w:val="right" w:leader="dot" w:pos="9345"/>
+            </w:tabs>
+            <w:rPr>
+              <w:rFonts w:asciiTheme="minorHAnsi" w:hAnsiTheme="minorHAnsi"/>
+              <w:noProof/>
+              <w:sz w:val="22"/>
+              <w:lang w:val="ru-RU" w:eastAsia="ru-RU"/>
+            </w:rPr>
+          </w:pPr>
+          <w:hyperlink w:anchor="_Toc222945248" w:history="1">
+            <w:r>
+              <w:rPr>
+                <w:rStyle w:val="a6"/>
+                <w:noProof/>
+                <w:lang w:val="ru-RU" w:eastAsia="ru-RU"/>
+              </w:rPr>
+              <w:t>Задание 4:</w:t>
+            </w:r>
+            <w:r>
+              <w:rPr>
+                <w:noProof/>
+                <w:webHidden/>
+              </w:rPr>
+              <w:tab/>
+            </w:r>
+            <w:r>
+              <w:rPr>
+                <w:noProof/>
+                <w:webHidden/>
+              </w:rPr>
+              <w:fldChar w:fldCharType="begin"/>
+            </w:r>
+            <w:r>
+              <w:rPr>
+                <w:noProof/>
+                <w:webHidden/>
+              </w:rPr>
+              <w:instrText xml:space="preserve"> PAGEREF _Toc222945248 \h </w:instrText>
+            </w:r>
+            <w:r>
+              <w:rPr>
+                <w:noProof/>
+                <w:webHidden/>
+              </w:rPr>
+            </w:r>
+            <w:r>
+              <w:rPr>
+                <w:noProof/>
+                <w:webHidden/>
+              </w:rPr>
+              <w:fldChar w:fldCharType="separate"/>
+            </w:r>
+            <w:r>
+              <w:rPr>
+                <w:noProof/>
+                <w:webHidden/>
+              </w:rPr>
+              <w:t>10</w:t>
+            </w:r>
+            <w:r>
+              <w:rPr>
+                <w:noProof/>
+                <w:webHidden/>
+              </w:rPr>
+              <w:fldChar w:fldCharType="end"/>
+            </w:r>
+          </w:hyperlink>
+        </w:p>
+        <w:p>
+          <w:pPr>
+            <w:pStyle w:val="21"/>
+            <w:tabs>
+              <w:tab w:val="right" w:leader="dot" w:pos="9345"/>
+            </w:tabs>
+            <w:rPr>
+              <w:rFonts w:asciiTheme="minorHAnsi" w:hAnsiTheme="minorHAnsi"/>
+              <w:noProof/>
+              <w:sz w:val="22"/>
+              <w:lang w:val="ru-RU" w:eastAsia="ru-RU"/>
+            </w:rPr>
+          </w:pPr>
+          <w:hyperlink w:anchor="_Toc222945249" w:history="1">
+            <w:r>
+              <w:rPr>
+                <w:rStyle w:val="a6"/>
+                <w:noProof/>
+                <w:lang w:val="ru-RU" w:eastAsia="ru-RU"/>
+              </w:rPr>
+              <w:t>Самостоятельный запрос 1:</w:t>
+            </w:r>
+            <w:r>
+              <w:rPr>
+                <w:noProof/>
+                <w:webHidden/>
+              </w:rPr>
+              <w:tab/>
+            </w:r>
+            <w:r>
+              <w:rPr>
+                <w:noProof/>
+                <w:webHidden/>
+              </w:rPr>
+              <w:fldChar w:fldCharType="begin"/>
+            </w:r>
+            <w:r>
+              <w:rPr>
+                <w:noProof/>
+                <w:webHidden/>
+              </w:rPr>
+              <w:instrText xml:space="preserve"> PAGEREF _Toc222945249 \h </w:instrText>
+            </w:r>
+            <w:r>
+              <w:rPr>
+                <w:noProof/>
+                <w:webHidden/>
+              </w:rPr>
+            </w:r>
+            <w:r>
+              <w:rPr>
+                <w:noProof/>
+                <w:webHidden/>
+              </w:rPr>
+              <w:fldChar w:fldCharType="separate"/>
+            </w:r>
+            <w:r>
+              <w:rPr>
+                <w:noProof/>
+                <w:webHidden/>
+              </w:rPr>
+              <w:t>10</w:t>
+            </w:r>
+            <w:r>
+              <w:rPr>
+                <w:noProof/>
+                <w:webHidden/>
+              </w:rPr>
+              <w:fldChar w:fldCharType="end"/>
+            </w:r>
+          </w:hyperlink>
+        </w:p>
+        <w:p>
+          <w:pPr>
+            <w:pStyle w:val="21"/>
+            <w:tabs>
+              <w:tab w:val="right" w:leader="dot" w:pos="9345"/>
+            </w:tabs>
+            <w:rPr>
+              <w:rFonts w:asciiTheme="minorHAnsi" w:hAnsiTheme="minorHAnsi"/>
+              <w:noProof/>
+              <w:sz w:val="22"/>
+              <w:lang w:val="ru-RU" w:eastAsia="ru-RU"/>
+            </w:rPr>
+          </w:pPr>
+          <w:hyperlink w:anchor="_Toc222945250" w:history="1">
+            <w:r>
+              <w:rPr>
+                <w:rStyle w:val="a6"/>
+                <w:noProof/>
+                <w:lang w:val="ru-RU" w:eastAsia="ru-RU"/>
+              </w:rPr>
+              <w:t>Самостоятельный запрос 2:</w:t>
+            </w:r>
+            <w:r>
+              <w:rPr>
+                <w:noProof/>
+                <w:webHidden/>
+              </w:rPr>
+              <w:tab/>
+            </w:r>
+            <w:r>
+              <w:rPr>
+                <w:noProof/>
+                <w:webHidden/>
+              </w:rPr>
+              <w:fldChar w:fldCharType="begin"/>
+            </w:r>
+            <w:r>
+              <w:rPr>
+                <w:noProof/>
+                <w:webHidden/>
+              </w:rPr>
+              <w:instrText xml:space="preserve"> PAGEREF _Toc222945250 \h </w:instrText>
+            </w:r>
+            <w:r>
+              <w:rPr>
+                <w:noProof/>
+                <w:webHidden/>
+              </w:rPr>
+            </w:r>
+            <w:r>
+              <w:rPr>
+                <w:noProof/>
+                <w:webHidden/>
+              </w:rPr>
+              <w:fldChar w:fldCharType="separate"/>
+            </w:r>
+            <w:r>
+              <w:rPr>
+                <w:noProof/>
+                <w:webHidden/>
+              </w:rPr>
               <w:t>11</w:t>
+            </w:r>
+            <w:r>
+              <w:rPr>
+                <w:noProof/>
+                <w:webHidden/>
+              </w:rPr>
+              <w:fldChar w:fldCharType="end"/>
+            </w:r>
+          </w:hyperlink>
+        </w:p>
+        <w:p>
+          <w:pPr>
+            <w:pStyle w:val="21"/>
+            <w:tabs>
+              <w:tab w:val="right" w:leader="dot" w:pos="9345"/>
+            </w:tabs>
+            <w:rPr>
+              <w:rFonts w:asciiTheme="minorHAnsi" w:hAnsiTheme="minorHAnsi"/>
+              <w:noProof/>
+              <w:sz w:val="22"/>
+              <w:lang w:val="ru-RU" w:eastAsia="ru-RU"/>
+            </w:rPr>
+          </w:pPr>
+          <w:hyperlink w:anchor="_Toc222945251" w:history="1">
+            <w:r>
+              <w:rPr>
+                <w:rStyle w:val="a6"/>
+                <w:noProof/>
+                <w:lang w:val="ru-RU" w:eastAsia="ru-RU"/>
+              </w:rPr>
+              <w:t>Самостоятельный запрос 3:</w:t>
+            </w:r>
+            <w:r>
+              <w:rPr>
+                <w:noProof/>
+                <w:webHidden/>
+              </w:rPr>
+              <w:tab/>
+            </w:r>
+            <w:r>
+              <w:rPr>
+                <w:noProof/>
+                <w:webHidden/>
+              </w:rPr>
+              <w:fldChar w:fldCharType="begin"/>
+            </w:r>
+            <w:r>
+              <w:rPr>
+                <w:noProof/>
+                <w:webHidden/>
+              </w:rPr>
+              <w:instrText xml:space="preserve"> PAGEREF _Toc222945251 \h </w:instrText>
+            </w:r>
+            <w:r>
+              <w:rPr>
+                <w:noProof/>
+                <w:webHidden/>
+              </w:rPr>
+            </w:r>
+            <w:r>
+              <w:rPr>
+                <w:noProof/>
+                <w:webHidden/>
+              </w:rPr>
+              <w:fldChar w:fldCharType="separate"/>
+            </w:r>
+            <w:r>
+              <w:rPr>
+                <w:noProof/>
+                <w:webHidden/>
+              </w:rPr>
+              <w:t>11</w:t>
+            </w:r>
+            <w:r>
+              <w:rPr>
+                <w:noProof/>
+                <w:webHidden/>
+              </w:rPr>
+              <w:fldChar w:fldCharType="end"/>
+            </w:r>
+          </w:hyperlink>
+        </w:p>
+        <w:p>
+          <w:pPr>
+            <w:pStyle w:val="21"/>
+            <w:tabs>
+              <w:tab w:val="right" w:leader="dot" w:pos="9345"/>
+            </w:tabs>
+            <w:rPr>
+              <w:rFonts w:asciiTheme="minorHAnsi" w:hAnsiTheme="minorHAnsi"/>
+              <w:noProof/>
+              <w:sz w:val="22"/>
+              <w:lang w:val="ru-RU" w:eastAsia="ru-RU"/>
+            </w:rPr>
+          </w:pPr>
+          <w:hyperlink w:anchor="_Toc222945252" w:history="1">
+            <w:r>
+              <w:rPr>
+                <w:rStyle w:val="a6"/>
+                <w:noProof/>
+                <w:lang w:val="ru-RU" w:eastAsia="ru-RU"/>
+              </w:rPr>
+              <w:t>Самостоятельный запрос 4:</w:t>
+            </w:r>
+            <w:r>
+              <w:rPr>
+                <w:noProof/>
+                <w:webHidden/>
+              </w:rPr>
+              <w:tab/>
+            </w:r>
+            <w:r>
+              <w:rPr>
+                <w:noProof/>
+                <w:webHidden/>
+              </w:rPr>
+              <w:fldChar w:fldCharType="begin"/>
+            </w:r>
+            <w:r>
+              <w:rPr>
+                <w:noProof/>
+                <w:webHidden/>
+              </w:rPr>
+              <w:instrText xml:space="preserve"> PAGEREF _Toc222945252 \h </w:instrText>
+            </w:r>
+            <w:r>
+              <w:rPr>
+                <w:noProof/>
+                <w:webHidden/>
+              </w:rPr>
+            </w:r>
+            <w:r>
+              <w:rPr>
+                <w:noProof/>
+                <w:webHidden/>
+              </w:rPr>
+              <w:fldChar w:fldCharType="separate"/>
+            </w:r>
+            <w:r>
+              <w:rPr>
+                <w:noProof/>
+                <w:webHidden/>
+              </w:rPr>
+              <w:t>12</w:t>
+            </w:r>
+            <w:r>
+              <w:rPr>
+                <w:noProof/>
+                <w:webHidden/>
+              </w:rPr>
+              <w:fldChar w:fldCharType="end"/>
+            </w:r>
+          </w:hyperlink>
+        </w:p>
+        <w:p>
+          <w:pPr>
+            <w:pStyle w:val="21"/>
+            <w:tabs>
+              <w:tab w:val="right" w:leader="dot" w:pos="9345"/>
+            </w:tabs>
+            <w:rPr>
+              <w:rFonts w:asciiTheme="minorHAnsi" w:hAnsiTheme="minorHAnsi"/>
+              <w:noProof/>
+              <w:sz w:val="22"/>
+              <w:lang w:val="ru-RU" w:eastAsia="ru-RU"/>
+            </w:rPr>
+          </w:pPr>
+          <w:hyperlink w:anchor="_Toc222945253" w:history="1">
+            <w:r>
+              <w:rPr>
+                <w:rStyle w:val="a6"/>
+                <w:noProof/>
+                <w:lang w:val="ru-RU" w:eastAsia="ru-RU"/>
+              </w:rPr>
+              <w:t>Самостоятельный запрос 5:</w:t>
+            </w:r>
+            <w:r>
+              <w:rPr>
+                <w:noProof/>
+                <w:webHidden/>
+              </w:rPr>
+              <w:tab/>
+            </w:r>
+            <w:r>
+              <w:rPr>
+                <w:noProof/>
+                <w:webHidden/>
+              </w:rPr>
+              <w:fldChar w:fldCharType="begin"/>
+            </w:r>
+            <w:r>
+              <w:rPr>
+                <w:noProof/>
+                <w:webHidden/>
+              </w:rPr>
+              <w:instrText xml:space="preserve"> PAGEREF _Toc222945253 \h </w:instrText>
+            </w:r>
+            <w:r>
+              <w:rPr>
+                <w:noProof/>
+                <w:webHidden/>
+              </w:rPr>
+            </w:r>
+            <w:r>
+              <w:rPr>
+                <w:noProof/>
+                <w:webHidden/>
+              </w:rPr>
+              <w:fldChar w:fldCharType="separate"/>
+            </w:r>
+            <w:r>
+              <w:rPr>
+                <w:noProof/>
+                <w:webHidden/>
+              </w:rPr>
+              <w:t>12</w:t>
+            </w:r>
+            <w:r>
+              <w:rPr>
+                <w:noProof/>
+                <w:webHidden/>
+              </w:rPr>
+              <w:fldChar w:fldCharType="end"/>
+            </w:r>
+          </w:hyperlink>
+        </w:p>
+        <w:p>
+          <w:pPr>
+            <w:pStyle w:val="21"/>
+            <w:tabs>
+              <w:tab w:val="right" w:leader="dot" w:pos="9345"/>
+            </w:tabs>
+            <w:rPr>
+              <w:rFonts w:asciiTheme="minorHAnsi" w:hAnsiTheme="minorHAnsi"/>
+              <w:noProof/>
+              <w:sz w:val="22"/>
+              <w:lang w:val="ru-RU" w:eastAsia="ru-RU"/>
+            </w:rPr>
+          </w:pPr>
+          <w:hyperlink w:anchor="_Toc222945254" w:history="1">
+            <w:r>
+              <w:rPr>
+                <w:rStyle w:val="a6"/>
+                <w:noProof/>
+                <w:lang w:val="ru-RU" w:eastAsia="ru-RU"/>
+              </w:rPr>
+              <w:t>Самостоятельный запрос 6:</w:t>
+            </w:r>
+            <w:r>
+              <w:rPr>
+                <w:noProof/>
+                <w:webHidden/>
+              </w:rPr>
+              <w:tab/>
+            </w:r>
+            <w:r>
+              <w:rPr>
+                <w:noProof/>
+                <w:webHidden/>
+              </w:rPr>
+              <w:fldChar w:fldCharType="begin"/>
+            </w:r>
+            <w:r>
+              <w:rPr>
+                <w:noProof/>
+                <w:webHidden/>
+              </w:rPr>
+              <w:instrText xml:space="preserve"> PAGEREF _Toc222945254 \h </w:instrText>
+            </w:r>
+            <w:r>
+              <w:rPr>
+                <w:noProof/>
+                <w:webHidden/>
+              </w:rPr>
+            </w:r>
+            <w:r>
+              <w:rPr>
+                <w:noProof/>
+                <w:webHidden/>
+              </w:rPr>
+              <w:fldChar w:fldCharType="separate"/>
+            </w:r>
+            <w:r>
+              <w:rPr>
+                <w:noProof/>
+                <w:webHidden/>
+              </w:rPr>
+              <w:t>12</w:t>
+            </w:r>
+            <w:r>
+              <w:rPr>
+                <w:noProof/>
+                <w:webHidden/>
+              </w:rPr>
+              <w:fldChar w:fldCharType="end"/>
+            </w:r>
+          </w:hyperlink>
+        </w:p>
+        <w:p>
+          <w:pPr>
+            <w:pStyle w:val="21"/>
+            <w:tabs>
+              <w:tab w:val="right" w:leader="dot" w:pos="9345"/>
+            </w:tabs>
+            <w:rPr>
+              <w:rFonts w:asciiTheme="minorHAnsi" w:hAnsiTheme="minorHAnsi"/>
+              <w:noProof/>
+              <w:sz w:val="22"/>
+              <w:lang w:val="ru-RU" w:eastAsia="ru-RU"/>
+            </w:rPr>
+          </w:pPr>
+          <w:hyperlink w:anchor="_Toc222945255" w:history="1">
+            <w:r>
+              <w:rPr>
+                <w:rStyle w:val="a6"/>
+                <w:noProof/>
+                <w:lang w:val="ru-RU" w:eastAsia="ru-RU"/>
+              </w:rPr>
+              <w:t>Самостоятельный запрос 7:</w:t>
+            </w:r>
+            <w:r>
+              <w:rPr>
+                <w:noProof/>
+                <w:webHidden/>
+              </w:rPr>
+              <w:tab/>
+            </w:r>
+            <w:r>
+              <w:rPr>
+                <w:noProof/>
+                <w:webHidden/>
+              </w:rPr>
+              <w:fldChar w:fldCharType="begin"/>
+            </w:r>
+            <w:r>
+              <w:rPr>
+                <w:noProof/>
+                <w:webHidden/>
+              </w:rPr>
+              <w:instrText xml:space="preserve"> PAGEREF _Toc222945255 \h </w:instrText>
+            </w:r>
+            <w:r>
+              <w:rPr>
+                <w:noProof/>
+                <w:webHidden/>
+              </w:rPr>
+            </w:r>
+            <w:r>
+              <w:rPr>
+                <w:noProof/>
+                <w:webHidden/>
+              </w:rPr>
+              <w:fldChar w:fldCharType="separate"/>
+            </w:r>
+            <w:r>
+              <w:rPr>
+                <w:noProof/>
+                <w:webHidden/>
+              </w:rPr>
+              <w:t>13</w:t>
+            </w:r>
+            <w:r>
+              <w:rPr>
+                <w:noProof/>
+                <w:webHidden/>
+              </w:rPr>
+              <w:fldChar w:fldCharType="end"/>
+            </w:r>
+          </w:hyperlink>
+        </w:p>
+        <w:p>
+          <w:pPr>
+            <w:pStyle w:val="21"/>
+            <w:tabs>
+              <w:tab w:val="right" w:leader="dot" w:pos="9345"/>
+            </w:tabs>
+            <w:rPr>
+              <w:rFonts w:asciiTheme="minorHAnsi" w:hAnsiTheme="minorHAnsi"/>
+              <w:noProof/>
+              <w:sz w:val="22"/>
+              <w:lang w:val="ru-RU" w:eastAsia="ru-RU"/>
+            </w:rPr>
+          </w:pPr>
+          <w:hyperlink w:anchor="_Toc222945256" w:history="1">
+            <w:r>
+              <w:rPr>
+                <w:rStyle w:val="a6"/>
+                <w:noProof/>
+                <w:lang w:val="ru-RU" w:eastAsia="ru-RU"/>
+              </w:rPr>
+              <w:t>Самостоятельный запрос 8:</w:t>
+            </w:r>
+            <w:r>
+              <w:rPr>
+                <w:noProof/>
+                <w:webHidden/>
+              </w:rPr>
+              <w:tab/>
+            </w:r>
+            <w:r>
+              <w:rPr>
+                <w:noProof/>
+                <w:webHidden/>
+              </w:rPr>
+              <w:fldChar w:fldCharType="begin"/>
+            </w:r>
+            <w:r>
+              <w:rPr>
+                <w:noProof/>
+                <w:webHidden/>
+              </w:rPr>
+              <w:instrText xml:space="preserve"> PAGEREF _Toc222945256 \h </w:instrText>
+            </w:r>
+            <w:r>
+              <w:rPr>
+                <w:noProof/>
+                <w:webHidden/>
+              </w:rPr>
+            </w:r>
+            <w:r>
+              <w:rPr>
+                <w:noProof/>
+                <w:webHidden/>
+              </w:rPr>
+              <w:fldChar w:fldCharType="separate"/>
+            </w:r>
+            <w:r>
+              <w:rPr>
+                <w:noProof/>
+                <w:webHidden/>
+              </w:rPr>
+              <w:t>13</w:t>
+            </w:r>
+            <w:r>
+              <w:rPr>
+                <w:noProof/>
+                <w:webHidden/>
+              </w:rPr>
+              <w:fldChar w:fldCharType="end"/>
+            </w:r>
+          </w:hyperlink>
+        </w:p>
+        <w:p>
+          <w:pPr>
+            <w:pStyle w:val="21"/>
+            <w:tabs>
+              <w:tab w:val="right" w:leader="dot" w:pos="9345"/>
+            </w:tabs>
+            <w:rPr>
+              <w:rFonts w:asciiTheme="minorHAnsi" w:hAnsiTheme="minorHAnsi"/>
+              <w:noProof/>
+              <w:sz w:val="22"/>
+              <w:lang w:val="ru-RU" w:eastAsia="ru-RU"/>
+            </w:rPr>
+          </w:pPr>
+          <w:hyperlink w:anchor="_Toc222945257" w:history="1">
+            <w:r>
+              <w:rPr>
+                <w:rStyle w:val="a6"/>
+                <w:noProof/>
+                <w:lang w:val="ru-RU" w:eastAsia="ru-RU"/>
+              </w:rPr>
+              <w:t>Самостоятельный запрос 9:</w:t>
+            </w:r>
+            <w:r>
+              <w:rPr>
+                <w:noProof/>
+                <w:webHidden/>
+              </w:rPr>
+              <w:tab/>
+            </w:r>
+            <w:r>
+              <w:rPr>
+                <w:noProof/>
+                <w:webHidden/>
+              </w:rPr>
+              <w:fldChar w:fldCharType="begin"/>
+            </w:r>
+            <w:r>
+              <w:rPr>
+                <w:noProof/>
+                <w:webHidden/>
+              </w:rPr>
+              <w:instrText xml:space="preserve"> PAGEREF _Toc222945257 \h </w:instrText>
+            </w:r>
+            <w:r>
+              <w:rPr>
+                <w:noProof/>
+                <w:webHidden/>
+              </w:rPr>
+            </w:r>
+            <w:r>
+              <w:rPr>
+                <w:noProof/>
+                <w:webHidden/>
+              </w:rPr>
+              <w:fldChar w:fldCharType="separate"/>
+            </w:r>
+            <w:r>
+              <w:rPr>
+                <w:noProof/>
+                <w:webHidden/>
+              </w:rPr>
+              <w:t>14</w:t>
+            </w:r>
+            <w:r>
+              <w:rPr>
+                <w:noProof/>
+                <w:webHidden/>
+              </w:rPr>
+              <w:fldChar w:fldCharType="end"/>
+            </w:r>
+          </w:hyperlink>
+        </w:p>
+        <w:p>
+          <w:pPr>
+            <w:pStyle w:val="21"/>
+            <w:tabs>
+              <w:tab w:val="right" w:leader="dot" w:pos="9345"/>
+            </w:tabs>
+            <w:rPr>
+              <w:rFonts w:asciiTheme="minorHAnsi" w:hAnsiTheme="minorHAnsi"/>
+              <w:noProof/>
+              <w:sz w:val="22"/>
+              <w:lang w:val="ru-RU" w:eastAsia="ru-RU"/>
+            </w:rPr>
+          </w:pPr>
+          <w:hyperlink w:anchor="_Toc222945258" w:history="1">
+            <w:r>
+              <w:rPr>
+                <w:rStyle w:val="a6"/>
+                <w:noProof/>
+                <w:lang w:val="ru-RU" w:eastAsia="ru-RU"/>
+              </w:rPr>
+              <w:t>Самостоятельный запрос 10:</w:t>
+            </w:r>
+            <w:r>
+              <w:rPr>
+                <w:noProof/>
+                <w:webHidden/>
+              </w:rPr>
+              <w:tab/>
+            </w:r>
+            <w:r>
+              <w:rPr>
+                <w:noProof/>
+                <w:webHidden/>
+              </w:rPr>
+              <w:fldChar w:fldCharType="begin"/>
+            </w:r>
+            <w:r>
+              <w:rPr>
+                <w:noProof/>
+                <w:webHidden/>
+              </w:rPr>
+              <w:instrText xml:space="preserve"> PAGEREF _Toc222945258 \h </w:instrText>
+            </w:r>
+            <w:r>
+              <w:rPr>
+                <w:noProof/>
+                <w:webHidden/>
+              </w:rPr>
+            </w:r>
+            <w:r>
+              <w:rPr>
+                <w:noProof/>
+                <w:webHidden/>
+              </w:rPr>
+              <w:fldChar w:fldCharType="separate"/>
+            </w:r>
+            <w:r>
+              <w:rPr>
+                <w:noProof/>
+                <w:webHidden/>
+              </w:rPr>
+              <w:t>14</w:t>
+            </w:r>
+            <w:r>
+              <w:rPr>
+                <w:noProof/>
+                <w:webHidden/>
+              </w:rPr>
+              <w:fldChar w:fldCharType="end"/>
+            </w:r>
+          </w:hyperlink>
+        </w:p>
+        <w:p>
+          <w:pPr>
+            <w:pStyle w:val="21"/>
+            <w:tabs>
+              <w:tab w:val="right" w:leader="dot" w:pos="9345"/>
+            </w:tabs>
+            <w:rPr>
+              <w:rFonts w:asciiTheme="minorHAnsi" w:hAnsiTheme="minorHAnsi"/>
+              <w:noProof/>
+              <w:sz w:val="22"/>
+              <w:lang w:val="ru-RU" w:eastAsia="ru-RU"/>
+            </w:rPr>
+          </w:pPr>
+          <w:hyperlink w:anchor="_Toc222945259" w:history="1">
+            <w:r>
+              <w:rPr>
+                <w:rStyle w:val="a6"/>
+                <w:noProof/>
+                <w:lang w:val="ru-RU" w:eastAsia="ru-RU"/>
+              </w:rPr>
+              <w:t>Самостоятельный запрос 11:</w:t>
+            </w:r>
+            <w:r>
+              <w:rPr>
+                <w:noProof/>
+                <w:webHidden/>
+              </w:rPr>
+              <w:tab/>
+            </w:r>
+            <w:r>
+              <w:rPr>
+                <w:noProof/>
+                <w:webHidden/>
+              </w:rPr>
+              <w:fldChar w:fldCharType="begin"/>
+            </w:r>
+            <w:r>
+              <w:rPr>
+                <w:noProof/>
+                <w:webHidden/>
+              </w:rPr>
+              <w:instrText xml:space="preserve"> PAGEREF _Toc222945259 \h </w:instrText>
+            </w:r>
+            <w:r>
+              <w:rPr>
+                <w:noProof/>
+                <w:webHidden/>
+              </w:rPr>
+            </w:r>
+            <w:r>
+              <w:rPr>
+                <w:noProof/>
+                <w:webHidden/>
+              </w:rPr>
+              <w:fldChar w:fldCharType="separate"/>
+            </w:r>
+            <w:r>
+              <w:rPr>
+                <w:noProof/>
+                <w:webHidden/>
+              </w:rPr>
+              <w:t>14</w:t>
+            </w:r>
+            <w:r>
+              <w:rPr>
+                <w:noProof/>
+                <w:webHidden/>
+              </w:rPr>
+              <w:fldChar w:fldCharType="end"/>
+            </w:r>
+          </w:hyperlink>
+        </w:p>
+        <w:p>
+          <w:pPr>
+            <w:pStyle w:val="21"/>
+            <w:tabs>
+              <w:tab w:val="right" w:leader="dot" w:pos="9345"/>
+            </w:tabs>
+            <w:rPr>
+              <w:rFonts w:asciiTheme="minorHAnsi" w:hAnsiTheme="minorHAnsi"/>
+              <w:noProof/>
+              <w:sz w:val="22"/>
+              <w:lang w:val="ru-RU" w:eastAsia="ru-RU"/>
+            </w:rPr>
+          </w:pPr>
+          <w:hyperlink w:anchor="_Toc222945260" w:history="1">
+            <w:r>
+              <w:rPr>
+                <w:rStyle w:val="a6"/>
+                <w:noProof/>
+                <w:lang w:val="ru-RU" w:eastAsia="ru-RU"/>
+              </w:rPr>
+              <w:t>Самостоятельный запрос 12:</w:t>
+            </w:r>
+            <w:r>
+              <w:rPr>
+                <w:noProof/>
+                <w:webHidden/>
+              </w:rPr>
+              <w:tab/>
+            </w:r>
+            <w:r>
+              <w:rPr>
+                <w:noProof/>
+                <w:webHidden/>
+              </w:rPr>
+              <w:fldChar w:fldCharType="begin"/>
+            </w:r>
+            <w:r>
+              <w:rPr>
+                <w:noProof/>
+                <w:webHidden/>
+              </w:rPr>
+              <w:instrText xml:space="preserve"> PAGEREF _Toc222945260 \h </w:instrText>
+            </w:r>
+            <w:r>
+              <w:rPr>
+                <w:noProof/>
+                <w:webHidden/>
+              </w:rPr>
+            </w:r>
+            <w:r>
+              <w:rPr>
+                <w:noProof/>
+                <w:webHidden/>
+              </w:rPr>
+              <w:fldChar w:fldCharType="separate"/>
+            </w:r>
+            <w:r>
+              <w:rPr>
+                <w:noProof/>
+                <w:webHidden/>
+              </w:rPr>
+              <w:t>15</w:t>
             </w:r>
             <w:r>
               <w:rPr>
@@ -1900,38 +2884,13 @@
     </w:sdt>
     <w:p>
       <w:pPr>
-        <w:rPr>
-          <w:rFonts w:eastAsia="Times New Roman" w:cstheme="majorBidi"/>
-          <w:b/>
-          <w:bCs/>
-          <w:color w:val="000000" w:themeColor="text1"/>
-          <w:sz w:val="36"/>
-          <w:szCs w:val="28"/>
-          <w:lang w:val="ru-RU" w:eastAsia="ru-RU"/>
-        </w:rPr>
-      </w:pPr>
-      <w:r>
-        <w:rPr>
-          <w:rFonts w:eastAsia="Times New Roman" w:cstheme="majorBidi"/>
-          <w:b/>
-          <w:bCs/>
-          <w:color w:val="000000" w:themeColor="text1"/>
-          <w:sz w:val="36"/>
-          <w:szCs w:val="28"/>
-          <w:lang w:val="ru-RU" w:eastAsia="ru-RU"/>
-        </w:rPr>
-        <w:br w:type="page"/>
-      </w:r>
-    </w:p>
-    <w:p>
-      <w:pPr>
         <w:pStyle w:val="1"/>
         <w:rPr>
           <w:rFonts w:eastAsia="Times New Roman"/>
           <w:lang w:val="ru-RU" w:eastAsia="ru-RU"/>
         </w:rPr>
       </w:pPr>
-      <w:bookmarkStart w:id="0" w:name="_Toc222822586"/>
+      <w:bookmarkStart w:id="0" w:name="_Toc222945232"/>
       <w:r>
         <w:rPr>
           <w:rFonts w:eastAsia="Times New Roman"/>
@@ -1950,7 +2909,7 @@
           <w:lang w:val="ru-RU" w:eastAsia="ru-RU"/>
         </w:rPr>
       </w:pPr>
-      <w:bookmarkStart w:id="1" w:name="_Toc222822587"/>
+      <w:bookmarkStart w:id="1" w:name="_Toc222945233"/>
       <w:r>
         <w:rPr>
           <w:rFonts w:eastAsia="Times New Roman"/>
@@ -1968,10 +2927,11 @@
       </w:pPr>
       <w:r>
         <w:rPr>
+          <w:noProof/>
           <w:lang w:val="ru-RU" w:eastAsia="ru-RU"/>
         </w:rPr>
         <w:drawing>
-          <wp:inline distT="0" distB="0" distL="0" distR="0" wp14:anchorId="3C4CDB2E" wp14:editId="6B814096">
+          <wp:inline distT="0" distB="0" distL="0" distR="0">
             <wp:extent cx="5801535" cy="2591162"/>
             <wp:effectExtent l="0" t="0" r="0" b="0"/>
             <wp:docPr id="1" name="Рисунок 1"/>
@@ -1986,7 +2946,7 @@
                     <pic:cNvPicPr/>
                   </pic:nvPicPr>
                   <pic:blipFill>
-                    <a:blip r:embed="rId7"/>
+                    <a:blip r:embed="rId6" cstate="print"/>
                     <a:stretch>
                       <a:fillRect/>
                     </a:stretch>
@@ -2014,7 +2974,7 @@
           <w:lang w:val="ru-RU" w:eastAsia="ru-RU"/>
         </w:rPr>
       </w:pPr>
-      <w:bookmarkStart w:id="2" w:name="_Toc222822588"/>
+      <w:bookmarkStart w:id="2" w:name="_Toc222945234"/>
       <w:r>
         <w:rPr>
           <w:lang w:val="ru-RU" w:eastAsia="ru-RU"/>
@@ -2031,10 +2991,11 @@
       </w:pPr>
       <w:r>
         <w:rPr>
-          <w:lang w:eastAsia="ru-RU"/>
+          <w:noProof/>
+          <w:lang w:val="ru-RU" w:eastAsia="ru-RU"/>
         </w:rPr>
         <w:drawing>
-          <wp:inline distT="0" distB="0" distL="0" distR="0" wp14:anchorId="5A6CA11C" wp14:editId="5A31B1E6">
+          <wp:inline distT="0" distB="0" distL="0" distR="0">
             <wp:extent cx="5940425" cy="4229847"/>
             <wp:effectExtent l="0" t="0" r="3175" b="0"/>
             <wp:docPr id="2" name="Рисунок 2"/>
@@ -2049,7 +3010,7 @@
                     <pic:cNvPicPr/>
                   </pic:nvPicPr>
                   <pic:blipFill>
-                    <a:blip r:embed="rId8"/>
+                    <a:blip r:embed="rId7" cstate="print"/>
                     <a:stretch>
                       <a:fillRect/>
                     </a:stretch>
@@ -2077,19 +3038,13 @@
           <w:lang w:val="ru-RU" w:eastAsia="ru-RU"/>
         </w:rPr>
       </w:pPr>
-      <w:bookmarkStart w:id="3" w:name="_Toc222822589"/>
+      <w:bookmarkStart w:id="3" w:name="_Toc222945235"/>
       <w:r>
         <w:rPr>
           <w:lang w:val="ru-RU" w:eastAsia="ru-RU"/>
         </w:rPr>
         <w:lastRenderedPageBreak/>
-        <w:t>Пример 3</w:t>
-      </w:r>
-      <w:r>
-        <w:rPr>
-          <w:lang w:val="ru-RU" w:eastAsia="ru-RU"/>
-        </w:rPr>
-        <w:t>:</w:t>
+        <w:t>Пример 3:</w:t>
       </w:r>
       <w:bookmarkEnd w:id="3"/>
     </w:p>
@@ -2101,10 +3056,11 @@
       </w:pPr>
       <w:r>
         <w:rPr>
+          <w:noProof/>
           <w:lang w:val="ru-RU" w:eastAsia="ru-RU"/>
         </w:rPr>
         <w:drawing>
-          <wp:inline distT="0" distB="0" distL="0" distR="0" wp14:anchorId="450590CC" wp14:editId="28E8E68E">
+          <wp:inline distT="0" distB="0" distL="0" distR="0">
             <wp:extent cx="5940425" cy="3107699"/>
             <wp:effectExtent l="0" t="0" r="3175" b="0"/>
             <wp:docPr id="3" name="Рисунок 3"/>
@@ -2119,7 +3075,7 @@
                     <pic:cNvPicPr/>
                   </pic:nvPicPr>
                   <pic:blipFill>
-                    <a:blip r:embed="rId9"/>
+                    <a:blip r:embed="rId8" cstate="print"/>
                     <a:stretch>
                       <a:fillRect/>
                     </a:stretch>
@@ -2147,18 +3103,12 @@
           <w:lang w:val="ru-RU" w:eastAsia="ru-RU"/>
         </w:rPr>
       </w:pPr>
-      <w:bookmarkStart w:id="4" w:name="_Toc222822590"/>
-      <w:r>
-        <w:rPr>
-          <w:lang w:val="ru-RU" w:eastAsia="ru-RU"/>
-        </w:rPr>
-        <w:t>Пример 4</w:t>
-      </w:r>
-      <w:r>
-        <w:rPr>
-          <w:lang w:val="ru-RU" w:eastAsia="ru-RU"/>
-        </w:rPr>
-        <w:t>:</w:t>
+      <w:bookmarkStart w:id="4" w:name="_Toc222945236"/>
+      <w:r>
+        <w:rPr>
+          <w:lang w:val="ru-RU" w:eastAsia="ru-RU"/>
+        </w:rPr>
+        <w:t>Пример 4:</w:t>
       </w:r>
       <w:bookmarkEnd w:id="4"/>
     </w:p>
@@ -2170,10 +3120,11 @@
       </w:pPr>
       <w:r>
         <w:rPr>
+          <w:noProof/>
           <w:lang w:val="ru-RU" w:eastAsia="ru-RU"/>
         </w:rPr>
         <w:drawing>
-          <wp:inline distT="0" distB="0" distL="0" distR="0" wp14:anchorId="6A74CC3E" wp14:editId="41E78946">
+          <wp:inline distT="0" distB="0" distL="0" distR="0">
             <wp:extent cx="5315692" cy="2486372"/>
             <wp:effectExtent l="0" t="0" r="0" b="9525"/>
             <wp:docPr id="4" name="Рисунок 4"/>
@@ -2188,7 +3139,7 @@
                     <pic:cNvPicPr/>
                   </pic:nvPicPr>
                   <pic:blipFill>
-                    <a:blip r:embed="rId10"/>
+                    <a:blip r:embed="rId9" cstate="print"/>
                     <a:stretch>
                       <a:fillRect/>
                     </a:stretch>
@@ -2216,18 +3167,12 @@
           <w:lang w:val="ru-RU" w:eastAsia="ru-RU"/>
         </w:rPr>
       </w:pPr>
-      <w:bookmarkStart w:id="5" w:name="_Toc222822591"/>
-      <w:r>
-        <w:rPr>
-          <w:lang w:val="ru-RU" w:eastAsia="ru-RU"/>
-        </w:rPr>
-        <w:t>Пример 5</w:t>
-      </w:r>
-      <w:r>
-        <w:rPr>
-          <w:lang w:val="ru-RU" w:eastAsia="ru-RU"/>
-        </w:rPr>
-        <w:t>:</w:t>
+      <w:bookmarkStart w:id="5" w:name="_Toc222945237"/>
+      <w:r>
+        <w:rPr>
+          <w:lang w:val="ru-RU" w:eastAsia="ru-RU"/>
+        </w:rPr>
+        <w:t>Пример 5:</w:t>
       </w:r>
       <w:bookmarkEnd w:id="5"/>
     </w:p>
@@ -2239,10 +3184,11 @@
       </w:pPr>
       <w:r>
         <w:rPr>
+          <w:noProof/>
           <w:lang w:val="ru-RU" w:eastAsia="ru-RU"/>
         </w:rPr>
         <w:drawing>
-          <wp:inline distT="0" distB="0" distL="0" distR="0" wp14:anchorId="6FF346D9" wp14:editId="7A3C7D7C">
+          <wp:inline distT="0" distB="0" distL="0" distR="0">
             <wp:extent cx="5940425" cy="2558509"/>
             <wp:effectExtent l="0" t="0" r="3175" b="0"/>
             <wp:docPr id="5" name="Рисунок 5"/>
@@ -2257,7 +3203,7 @@
                     <pic:cNvPicPr/>
                   </pic:nvPicPr>
                   <pic:blipFill>
-                    <a:blip r:embed="rId11"/>
+                    <a:blip r:embed="rId10" cstate="print"/>
                     <a:stretch>
                       <a:fillRect/>
                     </a:stretch>
@@ -2285,19 +3231,13 @@
           <w:lang w:val="ru-RU" w:eastAsia="ru-RU"/>
         </w:rPr>
       </w:pPr>
-      <w:bookmarkStart w:id="6" w:name="_Toc222822592"/>
+      <w:bookmarkStart w:id="6" w:name="_Toc222945238"/>
       <w:r>
         <w:rPr>
           <w:lang w:val="ru-RU" w:eastAsia="ru-RU"/>
         </w:rPr>
         <w:lastRenderedPageBreak/>
-        <w:t>Пример 6</w:t>
-      </w:r>
-      <w:r>
-        <w:rPr>
-          <w:lang w:val="ru-RU" w:eastAsia="ru-RU"/>
-        </w:rPr>
-        <w:t>:</w:t>
+        <w:t>Пример 6:</w:t>
       </w:r>
       <w:bookmarkEnd w:id="6"/>
     </w:p>
@@ -2309,10 +3249,11 @@
       </w:pPr>
       <w:r>
         <w:rPr>
+          <w:noProof/>
           <w:lang w:val="ru-RU" w:eastAsia="ru-RU"/>
         </w:rPr>
         <w:drawing>
-          <wp:inline distT="0" distB="0" distL="0" distR="0" wp14:anchorId="6A9F4F38" wp14:editId="0B04BE58">
+          <wp:inline distT="0" distB="0" distL="0" distR="0">
             <wp:extent cx="5940425" cy="2121361"/>
             <wp:effectExtent l="0" t="0" r="3175" b="0"/>
             <wp:docPr id="6" name="Рисунок 6"/>
@@ -2327,7 +3268,7 @@
                     <pic:cNvPicPr/>
                   </pic:nvPicPr>
                   <pic:blipFill>
-                    <a:blip r:embed="rId12"/>
+                    <a:blip r:embed="rId11" cstate="print"/>
                     <a:stretch>
                       <a:fillRect/>
                     </a:stretch>
@@ -2355,18 +3296,12 @@
           <w:lang w:val="ru-RU" w:eastAsia="ru-RU"/>
         </w:rPr>
       </w:pPr>
-      <w:bookmarkStart w:id="7" w:name="_Toc222822593"/>
-      <w:r>
-        <w:rPr>
-          <w:lang w:val="ru-RU" w:eastAsia="ru-RU"/>
-        </w:rPr>
-        <w:t>Пример 7</w:t>
-      </w:r>
-      <w:r>
-        <w:rPr>
-          <w:lang w:val="ru-RU" w:eastAsia="ru-RU"/>
-        </w:rPr>
-        <w:t>:</w:t>
+      <w:bookmarkStart w:id="7" w:name="_Toc222945239"/>
+      <w:r>
+        <w:rPr>
+          <w:lang w:val="ru-RU" w:eastAsia="ru-RU"/>
+        </w:rPr>
+        <w:t>Пример 7:</w:t>
       </w:r>
       <w:bookmarkEnd w:id="7"/>
     </w:p>
@@ -2378,10 +3313,11 @@
       </w:pPr>
       <w:r>
         <w:rPr>
+          <w:noProof/>
           <w:lang w:val="ru-RU" w:eastAsia="ru-RU"/>
         </w:rPr>
         <w:drawing>
-          <wp:inline distT="0" distB="0" distL="0" distR="0" wp14:anchorId="7E98EA85" wp14:editId="4B69E14F">
+          <wp:inline distT="0" distB="0" distL="0" distR="0">
             <wp:extent cx="4281704" cy="2790908"/>
             <wp:effectExtent l="0" t="0" r="5080" b="0"/>
             <wp:docPr id="7" name="Рисунок 7"/>
@@ -2396,7 +3332,7 @@
                     <pic:cNvPicPr/>
                   </pic:nvPicPr>
                   <pic:blipFill>
-                    <a:blip r:embed="rId13"/>
+                    <a:blip r:embed="rId12" cstate="print"/>
                     <a:stretch>
                       <a:fillRect/>
                     </a:stretch>
@@ -2424,18 +3360,12 @@
           <w:lang w:val="ru-RU" w:eastAsia="ru-RU"/>
         </w:rPr>
       </w:pPr>
-      <w:bookmarkStart w:id="8" w:name="_Toc222822594"/>
-      <w:r>
-        <w:rPr>
-          <w:lang w:val="ru-RU" w:eastAsia="ru-RU"/>
-        </w:rPr>
-        <w:t>Пример 8</w:t>
-      </w:r>
-      <w:r>
-        <w:rPr>
-          <w:lang w:val="ru-RU" w:eastAsia="ru-RU"/>
-        </w:rPr>
-        <w:t>:</w:t>
+      <w:bookmarkStart w:id="8" w:name="_Toc222945240"/>
+      <w:r>
+        <w:rPr>
+          <w:lang w:val="ru-RU" w:eastAsia="ru-RU"/>
+        </w:rPr>
+        <w:t>Пример 8:</w:t>
       </w:r>
       <w:bookmarkEnd w:id="8"/>
     </w:p>
@@ -2447,10 +3377,11 @@
       </w:pPr>
       <w:r>
         <w:rPr>
+          <w:noProof/>
           <w:lang w:val="ru-RU" w:eastAsia="ru-RU"/>
         </w:rPr>
         <w:drawing>
-          <wp:inline distT="0" distB="0" distL="0" distR="0" wp14:anchorId="33973420" wp14:editId="59366D8F">
+          <wp:inline distT="0" distB="0" distL="0" distR="0">
             <wp:extent cx="4595854" cy="3233082"/>
             <wp:effectExtent l="0" t="0" r="0" b="5715"/>
             <wp:docPr id="8" name="Рисунок 8"/>
@@ -2465,7 +3396,7 @@
                     <pic:cNvPicPr/>
                   </pic:nvPicPr>
                   <pic:blipFill>
-                    <a:blip r:embed="rId14"/>
+                    <a:blip r:embed="rId13" cstate="print"/>
                     <a:stretch>
                       <a:fillRect/>
                     </a:stretch>
@@ -2493,19 +3424,13 @@
           <w:lang w:val="ru-RU" w:eastAsia="ru-RU"/>
         </w:rPr>
       </w:pPr>
-      <w:bookmarkStart w:id="9" w:name="_Toc222822595"/>
+      <w:bookmarkStart w:id="9" w:name="_Toc222945241"/>
       <w:r>
         <w:rPr>
           <w:lang w:val="ru-RU" w:eastAsia="ru-RU"/>
         </w:rPr>
         <w:lastRenderedPageBreak/>
-        <w:t>Пример 9</w:t>
-      </w:r>
-      <w:r>
-        <w:rPr>
-          <w:lang w:val="ru-RU" w:eastAsia="ru-RU"/>
-        </w:rPr>
-        <w:t>:</w:t>
+        <w:t>Пример 9:</w:t>
       </w:r>
       <w:bookmarkEnd w:id="9"/>
     </w:p>
@@ -2517,10 +3442,11 @@
       </w:pPr>
       <w:r>
         <w:rPr>
+          <w:noProof/>
           <w:lang w:val="ru-RU" w:eastAsia="ru-RU"/>
         </w:rPr>
         <w:drawing>
-          <wp:inline distT="0" distB="0" distL="0" distR="0" wp14:anchorId="095C066B" wp14:editId="7A5AFE6F">
+          <wp:inline distT="0" distB="0" distL="0" distR="0">
             <wp:extent cx="5391902" cy="3286584"/>
             <wp:effectExtent l="0" t="0" r="0" b="9525"/>
             <wp:docPr id="9" name="Рисунок 9"/>
@@ -2535,7 +3461,7 @@
                     <pic:cNvPicPr/>
                   </pic:nvPicPr>
                   <pic:blipFill>
-                    <a:blip r:embed="rId15"/>
+                    <a:blip r:embed="rId14" cstate="print"/>
                     <a:stretch>
                       <a:fillRect/>
                     </a:stretch>
@@ -2563,18 +3489,12 @@
           <w:lang w:val="ru-RU" w:eastAsia="ru-RU"/>
         </w:rPr>
       </w:pPr>
-      <w:bookmarkStart w:id="10" w:name="_Toc222822596"/>
-      <w:r>
-        <w:rPr>
-          <w:lang w:val="ru-RU" w:eastAsia="ru-RU"/>
-        </w:rPr>
-        <w:t>Пример 10</w:t>
-      </w:r>
-      <w:r>
-        <w:rPr>
-          <w:lang w:val="ru-RU" w:eastAsia="ru-RU"/>
-        </w:rPr>
-        <w:t>:</w:t>
+      <w:bookmarkStart w:id="10" w:name="_Toc222945242"/>
+      <w:r>
+        <w:rPr>
+          <w:lang w:val="ru-RU" w:eastAsia="ru-RU"/>
+        </w:rPr>
+        <w:t>Пример 10:</w:t>
       </w:r>
       <w:bookmarkEnd w:id="10"/>
     </w:p>
@@ -2586,10 +3506,11 @@
       </w:pPr>
       <w:r>
         <w:rPr>
+          <w:noProof/>
           <w:lang w:val="ru-RU" w:eastAsia="ru-RU"/>
         </w:rPr>
         <w:drawing>
-          <wp:inline distT="0" distB="0" distL="0" distR="0" wp14:anchorId="3394A5E6" wp14:editId="29EC771A">
+          <wp:inline distT="0" distB="0" distL="0" distR="0">
             <wp:extent cx="5940425" cy="3670078"/>
             <wp:effectExtent l="0" t="0" r="3175" b="6985"/>
             <wp:docPr id="10" name="Рисунок 10"/>
@@ -2604,7 +3525,7 @@
                     <pic:cNvPicPr/>
                   </pic:nvPicPr>
                   <pic:blipFill>
-                    <a:blip r:embed="rId16"/>
+                    <a:blip r:embed="rId15" cstate="print"/>
                     <a:stretch>
                       <a:fillRect/>
                     </a:stretch>
@@ -2632,19 +3553,13 @@
           <w:lang w:val="ru-RU" w:eastAsia="ru-RU"/>
         </w:rPr>
       </w:pPr>
-      <w:bookmarkStart w:id="11" w:name="_Toc222822597"/>
+      <w:bookmarkStart w:id="11" w:name="_Toc222945243"/>
       <w:r>
         <w:rPr>
           <w:lang w:val="ru-RU" w:eastAsia="ru-RU"/>
         </w:rPr>
         <w:lastRenderedPageBreak/>
-        <w:t>Пример 11</w:t>
-      </w:r>
-      <w:r>
-        <w:rPr>
-          <w:lang w:val="ru-RU" w:eastAsia="ru-RU"/>
-        </w:rPr>
-        <w:t>:</w:t>
+        <w:t>Пример 11:</w:t>
       </w:r>
       <w:bookmarkEnd w:id="11"/>
     </w:p>
@@ -2656,10 +3571,11 @@
       </w:pPr>
       <w:r>
         <w:rPr>
+          <w:noProof/>
           <w:lang w:val="ru-RU" w:eastAsia="ru-RU"/>
         </w:rPr>
         <w:drawing>
-          <wp:inline distT="0" distB="0" distL="0" distR="0" wp14:anchorId="33FAA7D3" wp14:editId="5A388F14">
+          <wp:inline distT="0" distB="0" distL="0" distR="0">
             <wp:extent cx="5940425" cy="3503925"/>
             <wp:effectExtent l="0" t="0" r="3175" b="1905"/>
             <wp:docPr id="11" name="Рисунок 11"/>
@@ -2674,7 +3590,7 @@
                     <pic:cNvPicPr/>
                   </pic:nvPicPr>
                   <pic:blipFill>
-                    <a:blip r:embed="rId17"/>
+                    <a:blip r:embed="rId16" cstate="print"/>
                     <a:stretch>
                       <a:fillRect/>
                     </a:stretch>
@@ -2702,24 +3618,12 @@
           <w:lang w:val="ru-RU" w:eastAsia="ru-RU"/>
         </w:rPr>
       </w:pPr>
-      <w:bookmarkStart w:id="12" w:name="_Toc222822598"/>
-      <w:r>
-        <w:rPr>
-          <w:lang w:val="ru-RU" w:eastAsia="ru-RU"/>
-        </w:rPr>
-        <w:t xml:space="preserve">Пример </w:t>
-      </w:r>
-      <w:r>
-        <w:rPr>
-          <w:lang w:val="ru-RU" w:eastAsia="ru-RU"/>
-        </w:rPr>
-        <w:t>1</w:t>
-      </w:r>
-      <w:r>
-        <w:rPr>
-          <w:lang w:val="ru-RU" w:eastAsia="ru-RU"/>
-        </w:rPr>
-        <w:t>2:</w:t>
+      <w:bookmarkStart w:id="12" w:name="_Toc222945244"/>
+      <w:r>
+        <w:rPr>
+          <w:lang w:val="ru-RU" w:eastAsia="ru-RU"/>
+        </w:rPr>
+        <w:t>Пример 12:</w:t>
       </w:r>
       <w:bookmarkEnd w:id="12"/>
     </w:p>
@@ -2731,10 +3635,11 @@
       </w:pPr>
       <w:r>
         <w:rPr>
+          <w:noProof/>
           <w:lang w:val="ru-RU" w:eastAsia="ru-RU"/>
         </w:rPr>
         <w:drawing>
-          <wp:inline distT="0" distB="0" distL="0" distR="0" wp14:anchorId="1B3914BD" wp14:editId="02DBCB13">
+          <wp:inline distT="0" distB="0" distL="0" distR="0">
             <wp:extent cx="4222143" cy="4507315"/>
             <wp:effectExtent l="0" t="0" r="6985" b="7620"/>
             <wp:docPr id="12" name="Рисунок 12"/>
@@ -2749,7 +3654,7 @@
                     <pic:cNvPicPr/>
                   </pic:nvPicPr>
                   <pic:blipFill>
-                    <a:blip r:embed="rId18"/>
+                    <a:blip r:embed="rId17" cstate="print"/>
                     <a:stretch>
                       <a:fillRect/>
                     </a:stretch>
@@ -2777,19 +3682,13 @@
           <w:lang w:val="ru-RU" w:eastAsia="ru-RU"/>
         </w:rPr>
       </w:pPr>
-      <w:bookmarkStart w:id="13" w:name="_Toc222822599"/>
+      <w:bookmarkStart w:id="13" w:name="_Toc222945245"/>
       <w:r>
         <w:rPr>
           <w:lang w:val="ru-RU" w:eastAsia="ru-RU"/>
         </w:rPr>
         <w:lastRenderedPageBreak/>
-        <w:t>Пример 13</w:t>
-      </w:r>
-      <w:r>
-        <w:rPr>
-          <w:lang w:val="ru-RU" w:eastAsia="ru-RU"/>
-        </w:rPr>
-        <w:t>:</w:t>
+        <w:t>Пример 13:</w:t>
       </w:r>
       <w:bookmarkEnd w:id="13"/>
     </w:p>
@@ -2801,10 +3700,11 @@
       </w:pPr>
       <w:r>
         <w:rPr>
+          <w:noProof/>
           <w:lang w:val="ru-RU" w:eastAsia="ru-RU"/>
         </w:rPr>
         <w:drawing>
-          <wp:inline distT="0" distB="0" distL="0" distR="0" wp14:anchorId="6C58A5FB" wp14:editId="7004B83F">
+          <wp:inline distT="0" distB="0" distL="0" distR="0">
             <wp:extent cx="5940425" cy="3716674"/>
             <wp:effectExtent l="0" t="0" r="3175" b="0"/>
             <wp:docPr id="13" name="Рисунок 13"/>
@@ -2819,7 +3719,7 @@
                     <pic:cNvPicPr/>
                   </pic:nvPicPr>
                   <pic:blipFill>
-                    <a:blip r:embed="rId19"/>
+                    <a:blip r:embed="rId18" cstate="print"/>
                     <a:stretch>
                       <a:fillRect/>
                     </a:stretch>
@@ -2847,18 +3747,12 @@
           <w:lang w:val="ru-RU" w:eastAsia="ru-RU"/>
         </w:rPr>
       </w:pPr>
-      <w:bookmarkStart w:id="14" w:name="_Toc222822600"/>
-      <w:r>
-        <w:rPr>
-          <w:lang w:val="ru-RU" w:eastAsia="ru-RU"/>
-        </w:rPr>
-        <w:t>Пример 14</w:t>
-      </w:r>
-      <w:r>
-        <w:rPr>
-          <w:lang w:val="ru-RU" w:eastAsia="ru-RU"/>
-        </w:rPr>
-        <w:t>:</w:t>
+      <w:bookmarkStart w:id="14" w:name="_Toc222945246"/>
+      <w:r>
+        <w:rPr>
+          <w:lang w:val="ru-RU" w:eastAsia="ru-RU"/>
+        </w:rPr>
+        <w:t>Пример 14:</w:t>
       </w:r>
       <w:bookmarkEnd w:id="14"/>
     </w:p>
@@ -2870,10 +3764,11 @@
       </w:pPr>
       <w:r>
         <w:rPr>
+          <w:noProof/>
           <w:lang w:val="ru-RU" w:eastAsia="ru-RU"/>
         </w:rPr>
         <w:drawing>
-          <wp:inline distT="0" distB="0" distL="0" distR="0" wp14:anchorId="0EEF5EFD" wp14:editId="14BBD7C9">
+          <wp:inline distT="0" distB="0" distL="0" distR="0">
             <wp:extent cx="4317559" cy="4280274"/>
             <wp:effectExtent l="0" t="0" r="6985" b="6350"/>
             <wp:docPr id="14" name="Рисунок 14"/>
@@ -2888,7 +3783,7 @@
                     <pic:cNvPicPr/>
                   </pic:nvPicPr>
                   <pic:blipFill>
-                    <a:blip r:embed="rId20"/>
+                    <a:blip r:embed="rId19" cstate="print"/>
                     <a:stretch>
                       <a:fillRect/>
                     </a:stretch>
@@ -2916,19 +3811,13 @@
           <w:lang w:val="ru-RU" w:eastAsia="ru-RU"/>
         </w:rPr>
       </w:pPr>
-      <w:bookmarkStart w:id="15" w:name="_Toc222822601"/>
+      <w:bookmarkStart w:id="15" w:name="_Toc222945247"/>
       <w:r>
         <w:rPr>
           <w:lang w:val="ru-RU" w:eastAsia="ru-RU"/>
         </w:rPr>
         <w:lastRenderedPageBreak/>
-        <w:t>Пример 15</w:t>
-      </w:r>
-      <w:r>
-        <w:rPr>
-          <w:lang w:val="ru-RU" w:eastAsia="ru-RU"/>
-        </w:rPr>
-        <w:t>:</w:t>
+        <w:t>Пример 15:</w:t>
       </w:r>
       <w:bookmarkEnd w:id="15"/>
     </w:p>
@@ -2940,10 +3829,11 @@
       </w:pPr>
       <w:r>
         <w:rPr>
+          <w:noProof/>
           <w:lang w:val="ru-RU" w:eastAsia="ru-RU"/>
         </w:rPr>
         <w:drawing>
-          <wp:inline distT="0" distB="0" distL="0" distR="0" wp14:anchorId="30E3372F" wp14:editId="581CF73C">
+          <wp:inline distT="0" distB="0" distL="0" distR="0">
             <wp:extent cx="5940425" cy="4216359"/>
             <wp:effectExtent l="0" t="0" r="3175" b="0"/>
             <wp:docPr id="15" name="Рисунок 15"/>
@@ -2958,7 +3848,7 @@
                     <pic:cNvPicPr/>
                   </pic:nvPicPr>
                   <pic:blipFill>
-                    <a:blip r:embed="rId21"/>
+                    <a:blip r:embed="rId20" cstate="print"/>
                     <a:stretch>
                       <a:fillRect/>
                     </a:stretch>
@@ -2986,12 +3876,14 @@
           <w:lang w:val="ru-RU" w:eastAsia="ru-RU"/>
         </w:rPr>
       </w:pPr>
+      <w:bookmarkStart w:id="16" w:name="_Toc222945248"/>
       <w:r>
         <w:rPr>
           <w:lang w:val="ru-RU" w:eastAsia="ru-RU"/>
         </w:rPr>
         <w:t>Задание 4:</w:t>
       </w:r>
+      <w:bookmarkEnd w:id="16"/>
     </w:p>
     <w:p>
       <w:pPr>
@@ -3000,12 +3892,14 @@
           <w:lang w:val="ru-RU" w:eastAsia="ru-RU"/>
         </w:rPr>
       </w:pPr>
+      <w:bookmarkStart w:id="17" w:name="_Toc222945249"/>
       <w:r>
         <w:rPr>
           <w:lang w:val="ru-RU" w:eastAsia="ru-RU"/>
         </w:rPr>
         <w:t>Самостоятельный запрос 1:</w:t>
       </w:r>
+      <w:bookmarkEnd w:id="17"/>
     </w:p>
     <w:p>
       <w:pPr>
@@ -3022,10 +3916,11 @@
       </w:pPr>
       <w:r>
         <w:rPr>
-          <w:lang w:eastAsia="ru-RU"/>
+          <w:noProof/>
+          <w:lang w:val="ru-RU" w:eastAsia="ru-RU"/>
         </w:rPr>
         <w:drawing>
-          <wp:inline distT="0" distB="0" distL="0" distR="0" wp14:anchorId="3CFF5820" wp14:editId="1EBBF871">
+          <wp:inline distT="0" distB="0" distL="0" distR="0">
             <wp:extent cx="4963218" cy="2553056"/>
             <wp:effectExtent l="0" t="0" r="8890" b="0"/>
             <wp:docPr id="16" name="Рисунок 16"/>
@@ -3040,7 +3935,7 @@
                     <pic:cNvPicPr/>
                   </pic:nvPicPr>
                   <pic:blipFill>
-                    <a:blip r:embed="rId22"/>
+                    <a:blip r:embed="rId21" cstate="print"/>
                     <a:stretch>
                       <a:fillRect/>
                     </a:stretch>
@@ -3068,19 +3963,15 @@
           <w:lang w:eastAsia="ru-RU"/>
         </w:rPr>
       </w:pPr>
+      <w:bookmarkStart w:id="18" w:name="_Toc222945250"/>
       <w:r>
         <w:rPr>
           <w:lang w:val="ru-RU" w:eastAsia="ru-RU"/>
         </w:rPr>
         <w:lastRenderedPageBreak/>
-        <w:t>Самостоятельный запрос 2</w:t>
-      </w:r>
-      <w:r>
-        <w:rPr>
-          <w:lang w:val="ru-RU" w:eastAsia="ru-RU"/>
-        </w:rPr>
-        <w:t>:</w:t>
-      </w:r>
+        <w:t>Самостоятельный запрос 2:</w:t>
+      </w:r>
+      <w:bookmarkEnd w:id="18"/>
     </w:p>
     <w:p>
       <w:pPr>
@@ -3090,10 +3981,11 @@
       </w:pPr>
       <w:r>
         <w:rPr>
-          <w:lang w:eastAsia="ru-RU"/>
+          <w:noProof/>
+          <w:lang w:val="ru-RU" w:eastAsia="ru-RU"/>
         </w:rPr>
         <w:drawing>
-          <wp:inline distT="0" distB="0" distL="0" distR="0" wp14:anchorId="03908EAD" wp14:editId="7AF02867">
+          <wp:inline distT="0" distB="0" distL="0" distR="0">
             <wp:extent cx="5940425" cy="4789004"/>
             <wp:effectExtent l="0" t="0" r="3175" b="0"/>
             <wp:docPr id="17" name="Рисунок 17"/>
@@ -3108,7 +4000,7 @@
                     <pic:cNvPicPr/>
                   </pic:nvPicPr>
                   <pic:blipFill>
-                    <a:blip r:embed="rId23"/>
+                    <a:blip r:embed="rId22" cstate="print"/>
                     <a:stretch>
                       <a:fillRect/>
                     </a:stretch>
@@ -3136,18 +4028,14 @@
           <w:lang w:eastAsia="ru-RU"/>
         </w:rPr>
       </w:pPr>
-      <w:r>
-        <w:rPr>
-          <w:lang w:val="ru-RU" w:eastAsia="ru-RU"/>
-        </w:rPr>
-        <w:t>Самостоятельный запрос 3</w:t>
-      </w:r>
-      <w:r>
-        <w:rPr>
-          <w:lang w:val="ru-RU" w:eastAsia="ru-RU"/>
-        </w:rPr>
-        <w:t>:</w:t>
-      </w:r>
+      <w:bookmarkStart w:id="19" w:name="_Toc222945251"/>
+      <w:r>
+        <w:rPr>
+          <w:lang w:val="ru-RU" w:eastAsia="ru-RU"/>
+        </w:rPr>
+        <w:t>Самостоятельный запрос 3:</w:t>
+      </w:r>
+      <w:bookmarkEnd w:id="19"/>
     </w:p>
     <w:p>
       <w:pPr>
@@ -3157,10 +4045,11 @@
       </w:pPr>
       <w:r>
         <w:rPr>
-          <w:lang w:eastAsia="ru-RU"/>
+          <w:noProof/>
+          <w:lang w:val="ru-RU" w:eastAsia="ru-RU"/>
         </w:rPr>
         <w:drawing>
-          <wp:inline distT="0" distB="0" distL="0" distR="0" wp14:anchorId="7BB6A353" wp14:editId="040A7E39">
+          <wp:inline distT="0" distB="0" distL="0" distR="0">
             <wp:extent cx="5940425" cy="1949691"/>
             <wp:effectExtent l="0" t="0" r="3175" b="0"/>
             <wp:docPr id="20" name="Рисунок 20"/>
@@ -3175,7 +4064,7 @@
                     <pic:cNvPicPr/>
                   </pic:nvPicPr>
                   <pic:blipFill>
-                    <a:blip r:embed="rId24"/>
+                    <a:blip r:embed="rId23" cstate="print"/>
                     <a:stretch>
                       <a:fillRect/>
                     </a:stretch>
@@ -3203,19 +4092,15 @@
           <w:lang w:eastAsia="ru-RU"/>
         </w:rPr>
       </w:pPr>
+      <w:bookmarkStart w:id="20" w:name="_Toc222945252"/>
       <w:r>
         <w:rPr>
           <w:lang w:val="ru-RU" w:eastAsia="ru-RU"/>
         </w:rPr>
         <w:lastRenderedPageBreak/>
-        <w:t>Самостоятельный запрос 4</w:t>
-      </w:r>
-      <w:r>
-        <w:rPr>
-          <w:lang w:val="ru-RU" w:eastAsia="ru-RU"/>
-        </w:rPr>
-        <w:t>:</w:t>
-      </w:r>
+        <w:t>Самостоятельный запрос 4:</w:t>
+      </w:r>
+      <w:bookmarkEnd w:id="20"/>
     </w:p>
     <w:p>
       <w:pPr>
@@ -3225,10 +4110,11 @@
       </w:pPr>
       <w:r>
         <w:rPr>
-          <w:lang w:eastAsia="ru-RU"/>
+          <w:noProof/>
+          <w:lang w:val="ru-RU" w:eastAsia="ru-RU"/>
         </w:rPr>
         <w:drawing>
-          <wp:inline distT="0" distB="0" distL="0" distR="0" wp14:anchorId="7A88539B" wp14:editId="133D0377">
+          <wp:inline distT="0" distB="0" distL="0" distR="0">
             <wp:extent cx="5940425" cy="2228656"/>
             <wp:effectExtent l="0" t="0" r="3175" b="635"/>
             <wp:docPr id="19" name="Рисунок 19"/>
@@ -3243,7 +4129,7 @@
                     <pic:cNvPicPr/>
                   </pic:nvPicPr>
                   <pic:blipFill>
-                    <a:blip r:embed="rId25"/>
+                    <a:blip r:embed="rId24" cstate="print"/>
                     <a:stretch>
                       <a:fillRect/>
                     </a:stretch>
@@ -3271,18 +4157,14 @@
           <w:lang w:eastAsia="ru-RU"/>
         </w:rPr>
       </w:pPr>
-      <w:r>
-        <w:rPr>
-          <w:lang w:val="ru-RU" w:eastAsia="ru-RU"/>
-        </w:rPr>
-        <w:t>Самостоятельный запрос 5</w:t>
-      </w:r>
-      <w:r>
-        <w:rPr>
-          <w:lang w:val="ru-RU" w:eastAsia="ru-RU"/>
-        </w:rPr>
-        <w:t>:</w:t>
-      </w:r>
+      <w:bookmarkStart w:id="21" w:name="_Toc222945253"/>
+      <w:r>
+        <w:rPr>
+          <w:lang w:val="ru-RU" w:eastAsia="ru-RU"/>
+        </w:rPr>
+        <w:t>Самостоятельный запрос 5:</w:t>
+      </w:r>
+      <w:bookmarkEnd w:id="21"/>
     </w:p>
     <w:p>
       <w:pPr>
@@ -3292,10 +4174,11 @@
       </w:pPr>
       <w:r>
         <w:rPr>
-          <w:lang w:eastAsia="ru-RU"/>
+          <w:noProof/>
+          <w:lang w:val="ru-RU" w:eastAsia="ru-RU"/>
         </w:rPr>
         <w:drawing>
-          <wp:inline distT="0" distB="0" distL="0" distR="0" wp14:anchorId="127D1FF4" wp14:editId="7EEF29F3">
+          <wp:inline distT="0" distB="0" distL="0" distR="0">
             <wp:extent cx="5940425" cy="2930054"/>
             <wp:effectExtent l="0" t="0" r="3175" b="3810"/>
             <wp:docPr id="21" name="Рисунок 21"/>
@@ -3310,7 +4193,7 @@
                     <pic:cNvPicPr/>
                   </pic:nvPicPr>
                   <pic:blipFill>
-                    <a:blip r:embed="rId26"/>
+                    <a:blip r:embed="rId25" cstate="print"/>
                     <a:stretch>
                       <a:fillRect/>
                     </a:stretch>
@@ -3338,18 +4221,14 @@
           <w:lang w:eastAsia="ru-RU"/>
         </w:rPr>
       </w:pPr>
-      <w:r>
-        <w:rPr>
-          <w:lang w:val="ru-RU" w:eastAsia="ru-RU"/>
-        </w:rPr>
-        <w:t>Самостоятельный запрос 6</w:t>
-      </w:r>
-      <w:r>
-        <w:rPr>
-          <w:lang w:val="ru-RU" w:eastAsia="ru-RU"/>
-        </w:rPr>
-        <w:t>:</w:t>
-      </w:r>
+      <w:bookmarkStart w:id="22" w:name="_Toc222945254"/>
+      <w:r>
+        <w:rPr>
+          <w:lang w:val="ru-RU" w:eastAsia="ru-RU"/>
+        </w:rPr>
+        <w:t>Самостоятельный запрос 6:</w:t>
+      </w:r>
+      <w:bookmarkEnd w:id="22"/>
     </w:p>
     <w:p>
       <w:pPr>
@@ -3359,10 +4238,11 @@
       </w:pPr>
       <w:r>
         <w:rPr>
-          <w:lang w:eastAsia="ru-RU"/>
+          <w:noProof/>
+          <w:lang w:val="ru-RU" w:eastAsia="ru-RU"/>
         </w:rPr>
         <w:drawing>
-          <wp:inline distT="0" distB="0" distL="0" distR="0" wp14:anchorId="74693826" wp14:editId="0596D29A">
+          <wp:inline distT="0" distB="0" distL="0" distR="0">
             <wp:extent cx="5940425" cy="2551765"/>
             <wp:effectExtent l="0" t="0" r="3175" b="1270"/>
             <wp:docPr id="22" name="Рисунок 22"/>
@@ -3377,7 +4257,7 @@
                     <pic:cNvPicPr/>
                   </pic:nvPicPr>
                   <pic:blipFill>
-                    <a:blip r:embed="rId27"/>
+                    <a:blip r:embed="rId26" cstate="print"/>
                     <a:stretch>
                       <a:fillRect/>
                     </a:stretch>
@@ -3405,19 +4285,15 @@
           <w:lang w:eastAsia="ru-RU"/>
         </w:rPr>
       </w:pPr>
+      <w:bookmarkStart w:id="23" w:name="_Toc222945255"/>
       <w:r>
         <w:rPr>
           <w:lang w:val="ru-RU" w:eastAsia="ru-RU"/>
         </w:rPr>
         <w:lastRenderedPageBreak/>
-        <w:t>Самостоятельный запрос 7</w:t>
-      </w:r>
-      <w:r>
-        <w:rPr>
-          <w:lang w:val="ru-RU" w:eastAsia="ru-RU"/>
-        </w:rPr>
-        <w:t>:</w:t>
-      </w:r>
+        <w:t>Самостоятельный запрос 7:</w:t>
+      </w:r>
+      <w:bookmarkEnd w:id="23"/>
     </w:p>
     <w:p>
       <w:pPr>
@@ -3427,10 +4303,11 @@
       </w:pPr>
       <w:r>
         <w:rPr>
-          <w:lang w:eastAsia="ru-RU"/>
+          <w:noProof/>
+          <w:lang w:val="ru-RU" w:eastAsia="ru-RU"/>
         </w:rPr>
         <w:drawing>
-          <wp:inline distT="0" distB="0" distL="0" distR="0" wp14:anchorId="12FD551D" wp14:editId="2D00EA58">
+          <wp:inline distT="0" distB="0" distL="0" distR="0">
             <wp:extent cx="5940425" cy="3597118"/>
             <wp:effectExtent l="0" t="0" r="3175" b="3810"/>
             <wp:docPr id="23" name="Рисунок 23"/>
@@ -3445,7 +4322,7 @@
                     <pic:cNvPicPr/>
                   </pic:nvPicPr>
                   <pic:blipFill>
-                    <a:blip r:embed="rId28"/>
+                    <a:blip r:embed="rId27" cstate="print"/>
                     <a:stretch>
                       <a:fillRect/>
                     </a:stretch>
@@ -3473,18 +4350,14 @@
           <w:lang w:eastAsia="ru-RU"/>
         </w:rPr>
       </w:pPr>
-      <w:r>
-        <w:rPr>
-          <w:lang w:val="ru-RU" w:eastAsia="ru-RU"/>
-        </w:rPr>
-        <w:t>Самостоятельный запрос 8</w:t>
-      </w:r>
-      <w:r>
-        <w:rPr>
-          <w:lang w:val="ru-RU" w:eastAsia="ru-RU"/>
-        </w:rPr>
-        <w:t>:</w:t>
-      </w:r>
+      <w:bookmarkStart w:id="24" w:name="_Toc222945256"/>
+      <w:r>
+        <w:rPr>
+          <w:lang w:val="ru-RU" w:eastAsia="ru-RU"/>
+        </w:rPr>
+        <w:t>Самостоятельный запрос 8:</w:t>
+      </w:r>
+      <w:bookmarkEnd w:id="24"/>
     </w:p>
     <w:p>
       <w:pPr>
@@ -3494,10 +4367,11 @@
       </w:pPr>
       <w:r>
         <w:rPr>
-          <w:lang w:eastAsia="ru-RU"/>
+          <w:noProof/>
+          <w:lang w:val="ru-RU" w:eastAsia="ru-RU"/>
         </w:rPr>
         <w:drawing>
-          <wp:inline distT="0" distB="0" distL="0" distR="0" wp14:anchorId="087119D0" wp14:editId="620F4187">
+          <wp:inline distT="0" distB="0" distL="0" distR="0">
             <wp:extent cx="5940425" cy="4277057"/>
             <wp:effectExtent l="0" t="0" r="3175" b="9525"/>
             <wp:docPr id="24" name="Рисунок 24"/>
@@ -3512,7 +4386,7 @@
                     <pic:cNvPicPr/>
                   </pic:nvPicPr>
                   <pic:blipFill>
-                    <a:blip r:embed="rId29"/>
+                    <a:blip r:embed="rId28" cstate="print"/>
                     <a:stretch>
                       <a:fillRect/>
                     </a:stretch>
@@ -3540,19 +4414,15 @@
           <w:lang w:eastAsia="ru-RU"/>
         </w:rPr>
       </w:pPr>
+      <w:bookmarkStart w:id="25" w:name="_Toc222945257"/>
       <w:r>
         <w:rPr>
           <w:lang w:val="ru-RU" w:eastAsia="ru-RU"/>
         </w:rPr>
         <w:lastRenderedPageBreak/>
-        <w:t>Самостоятельный запрос 9</w:t>
-      </w:r>
-      <w:r>
-        <w:rPr>
-          <w:lang w:val="ru-RU" w:eastAsia="ru-RU"/>
-        </w:rPr>
-        <w:t>:</w:t>
-      </w:r>
+        <w:t>Самостоятельный запрос 9:</w:t>
+      </w:r>
+      <w:bookmarkEnd w:id="25"/>
     </w:p>
     <w:p>
       <w:pPr>
@@ -3562,10 +4432,11 @@
       </w:pPr>
       <w:r>
         <w:rPr>
-          <w:lang w:eastAsia="ru-RU"/>
+          <w:noProof/>
+          <w:lang w:val="ru-RU" w:eastAsia="ru-RU"/>
         </w:rPr>
         <w:drawing>
-          <wp:inline distT="0" distB="0" distL="0" distR="0" wp14:anchorId="04E49BCB" wp14:editId="1AFED7B5">
+          <wp:inline distT="0" distB="0" distL="0" distR="0">
             <wp:extent cx="5940425" cy="1789669"/>
             <wp:effectExtent l="0" t="0" r="3175" b="1270"/>
             <wp:docPr id="25" name="Рисунок 25"/>
@@ -3580,7 +4451,7 @@
                     <pic:cNvPicPr/>
                   </pic:nvPicPr>
                   <pic:blipFill>
-                    <a:blip r:embed="rId30"/>
+                    <a:blip r:embed="rId29" cstate="print"/>
                     <a:stretch>
                       <a:fillRect/>
                     </a:stretch>
@@ -3608,24 +4479,14 @@
           <w:lang w:eastAsia="ru-RU"/>
         </w:rPr>
       </w:pPr>
-      <w:r>
-        <w:rPr>
-          <w:lang w:val="ru-RU" w:eastAsia="ru-RU"/>
-        </w:rPr>
-        <w:t>Самостоятельный запрос 1</w:t>
-      </w:r>
-      <w:r>
-        <w:rPr>
-          <w:lang w:val="ru-RU" w:eastAsia="ru-RU"/>
-        </w:rPr>
-        <w:t>0</w:t>
-      </w:r>
-      <w:r>
-        <w:rPr>
-          <w:lang w:val="ru-RU" w:eastAsia="ru-RU"/>
-        </w:rPr>
-        <w:t>:</w:t>
-      </w:r>
+      <w:bookmarkStart w:id="26" w:name="_Toc222945258"/>
+      <w:r>
+        <w:rPr>
+          <w:lang w:val="ru-RU" w:eastAsia="ru-RU"/>
+        </w:rPr>
+        <w:t>Самостоятельный запрос 10:</w:t>
+      </w:r>
+      <w:bookmarkEnd w:id="26"/>
     </w:p>
     <w:p>
       <w:pPr>
@@ -3635,10 +4496,11 @@
       </w:pPr>
       <w:r>
         <w:rPr>
-          <w:lang w:eastAsia="ru-RU"/>
+          <w:noProof/>
+          <w:lang w:val="ru-RU" w:eastAsia="ru-RU"/>
         </w:rPr>
         <w:drawing>
-          <wp:inline distT="0" distB="0" distL="0" distR="0" wp14:anchorId="2414BE77" wp14:editId="2C03BFB5">
+          <wp:inline distT="0" distB="0" distL="0" distR="0">
             <wp:extent cx="5940425" cy="1854045"/>
             <wp:effectExtent l="0" t="0" r="3175" b="0"/>
             <wp:docPr id="26" name="Рисунок 26"/>
@@ -3653,7 +4515,7 @@
                     <pic:cNvPicPr/>
                   </pic:nvPicPr>
                   <pic:blipFill>
-                    <a:blip r:embed="rId31"/>
+                    <a:blip r:embed="rId30" cstate="print"/>
                     <a:stretch>
                       <a:fillRect/>
                     </a:stretch>
@@ -3681,37 +4543,28 @@
           <w:lang w:eastAsia="ru-RU"/>
         </w:rPr>
       </w:pPr>
-      <w:r>
-        <w:rPr>
-          <w:lang w:val="ru-RU" w:eastAsia="ru-RU"/>
-        </w:rPr>
-        <w:t>Самостоятельный запрос 1</w:t>
-      </w:r>
-      <w:r>
-        <w:rPr>
-          <w:lang w:val="ru-RU" w:eastAsia="ru-RU"/>
-        </w:rPr>
-        <w:t>1</w:t>
-      </w:r>
-      <w:r>
-        <w:rPr>
-          <w:lang w:val="ru-RU" w:eastAsia="ru-RU"/>
-        </w:rPr>
-        <w:t>:</w:t>
-      </w:r>
-    </w:p>
-    <w:p>
-      <w:pPr>
-        <w:rPr>
-          <w:lang w:val="ru-RU" w:eastAsia="ru-RU"/>
-        </w:rPr>
-      </w:pPr>
-      <w:r>
-        <w:rPr>
+      <w:bookmarkStart w:id="27" w:name="_Toc222945259"/>
+      <w:r>
+        <w:rPr>
+          <w:lang w:val="ru-RU" w:eastAsia="ru-RU"/>
+        </w:rPr>
+        <w:t>Самостоятельный запрос 11:</w:t>
+      </w:r>
+      <w:bookmarkEnd w:id="27"/>
+    </w:p>
+    <w:p>
+      <w:pPr>
+        <w:rPr>
+          <w:lang w:val="ru-RU" w:eastAsia="ru-RU"/>
+        </w:rPr>
+      </w:pPr>
+      <w:r>
+        <w:rPr>
+          <w:noProof/>
           <w:lang w:val="ru-RU" w:eastAsia="ru-RU"/>
         </w:rPr>
         <w:drawing>
-          <wp:inline distT="0" distB="0" distL="0" distR="0" wp14:anchorId="56494F1C" wp14:editId="0A20DB75">
+          <wp:inline distT="0" distB="0" distL="0" distR="0">
             <wp:extent cx="5940425" cy="3040414"/>
             <wp:effectExtent l="0" t="0" r="3175" b="7620"/>
             <wp:docPr id="27" name="Рисунок 27"/>
@@ -3726,7 +4579,7 @@
                     <pic:cNvPicPr/>
                   </pic:nvPicPr>
                   <pic:blipFill>
-                    <a:blip r:embed="rId32"/>
+                    <a:blip r:embed="rId31" cstate="print"/>
                     <a:stretch>
                       <a:fillRect/>
                     </a:stretch>
@@ -3751,36 +4604,85 @@
       <w:pPr>
         <w:pStyle w:val="2"/>
         <w:rPr>
-          <w:lang w:val="ru-RU" w:eastAsia="ru-RU"/>
-        </w:rPr>
-      </w:pPr>
-      <w:r>
-        <w:rPr>
-          <w:lang w:val="ru-RU" w:eastAsia="ru-RU"/>
-        </w:rPr>
-        <w:t>Самостоятельный запрос 1</w:t>
-      </w:r>
-      <w:r>
-        <w:rPr>
-          <w:lang w:val="ru-RU" w:eastAsia="ru-RU"/>
-        </w:rPr>
-        <w:t>2</w:t>
-      </w:r>
-      <w:r>
-        <w:rPr>
-          <w:lang w:val="ru-RU" w:eastAsia="ru-RU"/>
-        </w:rPr>
-        <w:t>:</w:t>
-      </w:r>
-    </w:p>
-    <w:p>
-      <w:pPr>
-        <w:rPr>
-          <w:lang w:val="ru-RU" w:eastAsia="ru-RU"/>
-        </w:rPr>
-      </w:pPr>
-      <w:bookmarkStart w:id="16" w:name="_GoBack"/>
-      <w:bookmarkEnd w:id="16"/>
+          <w:lang w:eastAsia="ru-RU"/>
+        </w:rPr>
+      </w:pPr>
+      <w:bookmarkStart w:id="28" w:name="_Toc222945260"/>
+      <w:r>
+        <w:rPr>
+          <w:lang w:val="ru-RU" w:eastAsia="ru-RU"/>
+        </w:rPr>
+        <w:lastRenderedPageBreak/>
+        <w:t>Самостоятельный запрос 12:</w:t>
+      </w:r>
+      <w:bookmarkEnd w:id="28"/>
+    </w:p>
+    <w:p>
+      <w:pPr>
+        <w:rPr>
+          <w:lang w:eastAsia="ru-RU"/>
+        </w:rPr>
+      </w:pPr>
+      <w:r>
+        <w:rPr>
+          <w:noProof/>
+          <w:lang w:val="ru-RU" w:eastAsia="ru-RU"/>
+        </w:rPr>
+        <w:drawing>
+          <wp:inline distT="0" distB="0" distL="0" distR="0">
+            <wp:extent cx="5940425" cy="4693841"/>
+            <wp:effectExtent l="19050" t="0" r="3175" b="0"/>
+            <wp:docPr id="18" name="Рисунок 1"/>
+            <wp:cNvGraphicFramePr>
+              <a:graphicFrameLocks xmlns:a="http://schemas.openxmlformats.org/drawingml/2006/main" noChangeAspect="1"/>
+            </wp:cNvGraphicFramePr>
+            <a:graphic xmlns:a="http://schemas.openxmlformats.org/drawingml/2006/main">
+              <a:graphicData uri="http://schemas.openxmlformats.org/drawingml/2006/picture">
+                <pic:pic xmlns:pic="http://schemas.openxmlformats.org/drawingml/2006/picture">
+                  <pic:nvPicPr>
+                    <pic:cNvPr id="0" name="Picture 1"/>
+                    <pic:cNvPicPr>
+                      <a:picLocks noChangeAspect="1" noChangeArrowheads="1"/>
+                    </pic:cNvPicPr>
+                  </pic:nvPicPr>
+                  <pic:blipFill>
+                    <a:blip r:embed="rId32" cstate="print"/>
+                    <a:srcRect/>
+                    <a:stretch>
+                      <a:fillRect/>
+                    </a:stretch>
+                  </pic:blipFill>
+                  <pic:spPr bwMode="auto">
+                    <a:xfrm>
+                      <a:off x="0" y="0"/>
+                      <a:ext cx="5940425" cy="4693841"/>
+                    </a:xfrm>
+                    <a:prstGeom prst="rect">
+                      <a:avLst/>
+                    </a:prstGeom>
+                    <a:noFill/>
+                    <a:ln w="9525">
+                      <a:noFill/>
+                      <a:miter lim="800000"/>
+                      <a:headEnd/>
+                      <a:tailEnd/>
+                    </a:ln>
+                  </pic:spPr>
+                </pic:pic>
+              </a:graphicData>
+            </a:graphic>
+          </wp:inline>
+        </w:drawing>
+      </w:r>
+    </w:p>
+    <w:p>
+      <w:pPr>
+        <w:rPr>
+          <w:lang w:val="ru-RU" w:eastAsia="ru-RU"/>
+        </w:rPr>
+      </w:pPr>
+      <w:bookmarkStart w:id="29" w:name="_GoBack"/>
+      <w:bookmarkEnd w:id="29"/>
     </w:p>
     <w:p>
       <w:pPr>
@@ -3807,7 +4709,7 @@
 </file>
 
 <file path=word/styles.xml><?xml version="1.0" encoding="utf-8"?>
-<w:styles xmlns:mc="http://schemas.openxmlformats.org/markup-compatibility/2006" xmlns:r="http://schemas.openxmlformats.org/officeDocument/2006/relationships" xmlns:w="http://schemas.openxmlformats.org/wordprocessingml/2006/main" xmlns:w14="http://schemas.microsoft.com/office/word/2010/wordml" mc:Ignorable="w14">
+<w:styles xmlns:r="http://schemas.openxmlformats.org/officeDocument/2006/relationships" xmlns:w="http://schemas.openxmlformats.org/wordprocessingml/2006/main">
   <w:docDefaults>
     <w:rPrDefault>
       <w:rPr>
@@ -4029,6 +4931,7 @@
     <w:uiPriority w:val="99"/>
     <w:semiHidden/>
     <w:unhideWhenUsed/>
+    <w:qFormat/>
     <w:tblPr>
       <w:tblInd w:w="0" w:type="dxa"/>
       <w:tblCellMar>
@@ -4810,7 +5713,7 @@
 </file>
 
 <file path=customXml/itemProps1.xml><?xml version="1.0" encoding="utf-8"?>
-<ds:datastoreItem xmlns:ds="http://schemas.openxmlformats.org/officeDocument/2006/customXml" ds:itemID="{0B5BA1FF-74F9-46A1-8DAD-EB711781C83B}">
+<ds:datastoreItem xmlns:ds="http://schemas.openxmlformats.org/officeDocument/2006/customXml" ds:itemID="{1BF04764-50C4-40F6-A712-8F9921FCD987}">
   <ds:schemaRefs>
     <ds:schemaRef ds:uri="http://schemas.openxmlformats.org/officeDocument/2006/bibliography"/>
   </ds:schemaRefs>

</xml_diff>